<commit_message>
Fix risk-return figure label overlap + keep tables off page breaks
- rep_frontier.py: label only key policies (BH/adaptive/regime/floor/hybrid) with white label backgrounds, ray drawn behind points, grid points unlabelled -> no overlapping text near the dotted BH ray
- make_paper_pdf.py CSS: table/tr page-break-inside: avoid
- make_paper_docx.py: w:cantSplit on rows + keep_with_next -> tables no longer split across pages
- regenerate PDF (22 pp) and DOCX
</commit_message>
<xml_diff>
--- a/paper/manuscript_representation_utility.docx
+++ b/paper/manuscript_representation_utility.docx
@@ -1234,11 +1234,17 @@
         <w:gridCol w:w="2340"/>
       </w:tblGrid>
       <w:tr>
+        <w:trPr>
+          <w:cantSplit/>
+        </w:trPr>
         <w:tc>
           <w:tcPr>
             <w:tcW w:type="dxa" w:w="2340"/>
           </w:tcPr>
           <w:p>
+            <w:pPr>
+              <w:keepNext/>
+            </w:pPr>
             <w:r>
               <w:t>target</w:t>
             </w:r>
@@ -1249,6 +1255,9 @@
             <w:tcW w:type="dxa" w:w="2340"/>
           </w:tcPr>
           <w:p>
+            <w:pPr>
+              <w:keepNext/>
+            </w:pPr>
             <w:r>
               <w:t>linear</w:t>
             </w:r>
@@ -1259,6 +1268,9 @@
             <w:tcW w:type="dxa" w:w="2340"/>
           </w:tcPr>
           <w:p>
+            <w:pPr>
+              <w:keepNext/>
+            </w:pPr>
             <w:r>
               <w:t>GBDT</w:t>
             </w:r>
@@ -1269,6 +1281,9 @@
             <w:tcW w:type="dxa" w:w="2340"/>
           </w:tcPr>
           <w:p>
+            <w:pPr>
+              <w:keepNext/>
+            </w:pPr>
             <w:r>
               <w:t>MLP</w:t>
             </w:r>
@@ -1276,11 +1291,17 @@
         </w:tc>
       </w:tr>
       <w:tr>
+        <w:trPr>
+          <w:cantSplit/>
+        </w:trPr>
         <w:tc>
           <w:tcPr>
             <w:tcW w:type="dxa" w:w="2340"/>
           </w:tcPr>
           <w:p>
+            <w:pPr>
+              <w:keepNext/>
+            </w:pPr>
             <w:r>
               <w:t>direction_1 (AUC)</w:t>
             </w:r>
@@ -1291,6 +1312,9 @@
             <w:tcW w:type="dxa" w:w="2340"/>
           </w:tcPr>
           <w:p>
+            <w:pPr>
+              <w:keepNext/>
+            </w:pPr>
             <w:r>
               <w:t>.506–.521</w:t>
             </w:r>
@@ -1301,6 +1325,9 @@
             <w:tcW w:type="dxa" w:w="2340"/>
           </w:tcPr>
           <w:p>
+            <w:pPr>
+              <w:keepNext/>
+            </w:pPr>
             <w:r>
               <w:t>.503–.524</w:t>
             </w:r>
@@ -1311,6 +1338,9 @@
             <w:tcW w:type="dxa" w:w="2340"/>
           </w:tcPr>
           <w:p>
+            <w:pPr>
+              <w:keepNext/>
+            </w:pPr>
             <w:r>
               <w:t>.499–.509</w:t>
             </w:r>
@@ -1318,11 +1348,17 @@
         </w:tc>
       </w:tr>
       <w:tr>
+        <w:trPr>
+          <w:cantSplit/>
+        </w:trPr>
         <w:tc>
           <w:tcPr>
             <w:tcW w:type="dxa" w:w="2340"/>
           </w:tcPr>
           <w:p>
+            <w:pPr>
+              <w:keepNext/>
+            </w:pPr>
             <w:r>
               <w:t>magnitude_1 (R²)</w:t>
             </w:r>
@@ -1333,6 +1369,9 @@
             <w:tcW w:type="dxa" w:w="2340"/>
           </w:tcPr>
           <w:p>
+            <w:pPr>
+              <w:keepNext/>
+            </w:pPr>
             <w:r>
               <w:t>−.009–.018</w:t>
             </w:r>
@@ -1343,6 +1382,9 @@
             <w:tcW w:type="dxa" w:w="2340"/>
           </w:tcPr>
           <w:p>
+            <w:pPr>
+              <w:keepNext/>
+            </w:pPr>
             <w:r>
               <w:t>.023–.076</w:t>
             </w:r>
@@ -1353,6 +1395,9 @@
             <w:tcW w:type="dxa" w:w="2340"/>
           </w:tcPr>
           <w:p>
+            <w:pPr>
+              <w:keepNext/>
+            </w:pPr>
             <w:r>
               <w:t>.022–.079</w:t>
             </w:r>
@@ -1360,11 +1405,17 @@
         </w:tc>
       </w:tr>
       <w:tr>
+        <w:trPr>
+          <w:cantSplit/>
+        </w:trPr>
         <w:tc>
           <w:tcPr>
             <w:tcW w:type="dxa" w:w="2340"/>
           </w:tcPr>
           <w:p>
+            <w:pPr>
+              <w:keepNext/>
+            </w:pPr>
             <w:r>
               <w:t>vol_5 (R²)</w:t>
             </w:r>
@@ -1375,6 +1426,9 @@
             <w:tcW w:type="dxa" w:w="2340"/>
           </w:tcPr>
           <w:p>
+            <w:pPr>
+              <w:keepNext/>
+            </w:pPr>
             <w:r>
               <w:t>.034–.213</w:t>
             </w:r>
@@ -1385,6 +1439,9 @@
             <w:tcW w:type="dxa" w:w="2340"/>
           </w:tcPr>
           <w:p>
+            <w:pPr>
+              <w:keepNext/>
+            </w:pPr>
             <w:r>
               <w:t>.199–.293</w:t>
             </w:r>
@@ -1395,6 +1452,9 @@
             <w:tcW w:type="dxa" w:w="2340"/>
           </w:tcPr>
           <w:p>
+            <w:pPr>
+              <w:keepNext/>
+            </w:pPr>
             <w:r>
               <w:t>.046–.226</w:t>
             </w:r>
@@ -1402,11 +1462,17 @@
         </w:tc>
       </w:tr>
       <w:tr>
+        <w:trPr>
+          <w:cantSplit/>
+        </w:trPr>
         <w:tc>
           <w:tcPr>
             <w:tcW w:type="dxa" w:w="2340"/>
           </w:tcPr>
           <w:p>
+            <w:pPr>
+              <w:keepNext/>
+            </w:pPr>
             <w:r>
               <w:t>vol_20 (R²)</w:t>
             </w:r>
@@ -1417,6 +1483,9 @@
             <w:tcW w:type="dxa" w:w="2340"/>
           </w:tcPr>
           <w:p>
+            <w:pPr>
+              <w:keepNext/>
+            </w:pPr>
             <w:r>
               <w:t>−.007–.380</w:t>
             </w:r>
@@ -1427,6 +1496,9 @@
             <w:tcW w:type="dxa" w:w="2340"/>
           </w:tcPr>
           <w:p>
+            <w:pPr>
+              <w:keepNext/>
+            </w:pPr>
             <w:r>
               <w:t>.247–.288</w:t>
             </w:r>
@@ -1437,6 +1509,9 @@
             <w:tcW w:type="dxa" w:w="2340"/>
           </w:tcPr>
           <w:p>
+            <w:pPr>
+              <w:keepNext/>
+            </w:pPr>
             <w:r>
               <w:t>−.114–.098</w:t>
             </w:r>
@@ -1444,6 +1519,9 @@
         </w:tc>
       </w:tr>
       <w:tr>
+        <w:trPr>
+          <w:cantSplit/>
+        </w:trPr>
         <w:tc>
           <w:tcPr>
             <w:tcW w:type="dxa" w:w="2340"/>
@@ -1558,11 +1636,17 @@
         <w:gridCol w:w="1872"/>
       </w:tblGrid>
       <w:tr>
+        <w:trPr>
+          <w:cantSplit/>
+        </w:trPr>
         <w:tc>
           <w:tcPr>
             <w:tcW w:type="dxa" w:w="1872"/>
           </w:tcPr>
           <w:p>
+            <w:pPr>
+              <w:keepNext/>
+            </w:pPr>
             <w:r>
               <w:t>rep</w:t>
             </w:r>
@@ -1573,6 +1657,9 @@
             <w:tcW w:type="dxa" w:w="1872"/>
           </w:tcPr>
           <w:p>
+            <w:pPr>
+              <w:keepNext/>
+            </w:pPr>
             <w:r>
               <w:t>A2C</w:t>
             </w:r>
@@ -1583,6 +1670,9 @@
             <w:tcW w:type="dxa" w:w="1872"/>
           </w:tcPr>
           <w:p>
+            <w:pPr>
+              <w:keepNext/>
+            </w:pPr>
             <w:r>
               <w:t>BC</w:t>
             </w:r>
@@ -1593,6 +1683,9 @@
             <w:tcW w:type="dxa" w:w="1872"/>
           </w:tcPr>
           <w:p>
+            <w:pPr>
+              <w:keepNext/>
+            </w:pPr>
             <w:r>
               <w:t>IQL</w:t>
             </w:r>
@@ -1603,6 +1696,9 @@
             <w:tcW w:type="dxa" w:w="1872"/>
           </w:tcPr>
           <w:p>
+            <w:pPr>
+              <w:keepNext/>
+            </w:pPr>
             <w:r>
               <w:t>CQL</w:t>
             </w:r>
@@ -1610,11 +1706,17 @@
         </w:tc>
       </w:tr>
       <w:tr>
+        <w:trPr>
+          <w:cantSplit/>
+        </w:trPr>
         <w:tc>
           <w:tcPr>
             <w:tcW w:type="dxa" w:w="1872"/>
           </w:tcPr>
           <w:p>
+            <w:pPr>
+              <w:keepNext/>
+            </w:pPr>
             <w:r>
               <w:t>raw</w:t>
             </w:r>
@@ -1625,6 +1727,9 @@
             <w:tcW w:type="dxa" w:w="1872"/>
           </w:tcPr>
           <w:p>
+            <w:pPr>
+              <w:keepNext/>
+            </w:pPr>
             <w:r>
               <w:t>.362</w:t>
             </w:r>
@@ -1635,6 +1740,9 @@
             <w:tcW w:type="dxa" w:w="1872"/>
           </w:tcPr>
           <w:p>
+            <w:pPr>
+              <w:keepNext/>
+            </w:pPr>
             <w:r>
               <w:t>.682</w:t>
             </w:r>
@@ -1645,6 +1753,9 @@
             <w:tcW w:type="dxa" w:w="1872"/>
           </w:tcPr>
           <w:p>
+            <w:pPr>
+              <w:keepNext/>
+            </w:pPr>
             <w:r>
               <w:t>.559</w:t>
             </w:r>
@@ -1655,6 +1766,9 @@
             <w:tcW w:type="dxa" w:w="1872"/>
           </w:tcPr>
           <w:p>
+            <w:pPr>
+              <w:keepNext/>
+            </w:pPr>
             <w:r>
               <w:t>.574</w:t>
             </w:r>
@@ -1662,11 +1776,17 @@
         </w:tc>
       </w:tr>
       <w:tr>
+        <w:trPr>
+          <w:cantSplit/>
+        </w:trPr>
         <w:tc>
           <w:tcPr>
             <w:tcW w:type="dxa" w:w="1872"/>
           </w:tcPr>
           <w:p>
+            <w:pPr>
+              <w:keepNext/>
+            </w:pPr>
             <w:r>
               <w:t>auto</w:t>
             </w:r>
@@ -1677,6 +1797,9 @@
             <w:tcW w:type="dxa" w:w="1872"/>
           </w:tcPr>
           <w:p>
+            <w:pPr>
+              <w:keepNext/>
+            </w:pPr>
             <w:r>
               <w:t>.464</w:t>
             </w:r>
@@ -1687,6 +1810,9 @@
             <w:tcW w:type="dxa" w:w="1872"/>
           </w:tcPr>
           <w:p>
+            <w:pPr>
+              <w:keepNext/>
+            </w:pPr>
             <w:r>
               <w:t>.642</w:t>
             </w:r>
@@ -1697,6 +1823,9 @@
             <w:tcW w:type="dxa" w:w="1872"/>
           </w:tcPr>
           <w:p>
+            <w:pPr>
+              <w:keepNext/>
+            </w:pPr>
             <w:r>
               <w:t>.624</w:t>
             </w:r>
@@ -1707,6 +1836,9 @@
             <w:tcW w:type="dxa" w:w="1872"/>
           </w:tcPr>
           <w:p>
+            <w:pPr>
+              <w:keepNext/>
+            </w:pPr>
             <w:r>
               <w:t>.768</w:t>
             </w:r>
@@ -1714,11 +1846,17 @@
         </w:tc>
       </w:tr>
       <w:tr>
+        <w:trPr>
+          <w:cantSplit/>
+        </w:trPr>
         <w:tc>
           <w:tcPr>
             <w:tcW w:type="dxa" w:w="1872"/>
           </w:tcPr>
           <w:p>
+            <w:pPr>
+              <w:keepNext/>
+            </w:pPr>
             <w:r>
               <w:t>predictive</w:t>
             </w:r>
@@ -1729,6 +1867,9 @@
             <w:tcW w:type="dxa" w:w="1872"/>
           </w:tcPr>
           <w:p>
+            <w:pPr>
+              <w:keepNext/>
+            </w:pPr>
             <w:r>
               <w:t>.617</w:t>
             </w:r>
@@ -1739,6 +1880,9 @@
             <w:tcW w:type="dxa" w:w="1872"/>
           </w:tcPr>
           <w:p>
+            <w:pPr>
+              <w:keepNext/>
+            </w:pPr>
             <w:r>
               <w:t>.631</w:t>
             </w:r>
@@ -1749,6 +1893,9 @@
             <w:tcW w:type="dxa" w:w="1872"/>
           </w:tcPr>
           <w:p>
+            <w:pPr>
+              <w:keepNext/>
+            </w:pPr>
             <w:r>
               <w:t>.628</w:t>
             </w:r>
@@ -1759,6 +1906,9 @@
             <w:tcW w:type="dxa" w:w="1872"/>
           </w:tcPr>
           <w:p>
+            <w:pPr>
+              <w:keepNext/>
+            </w:pPr>
             <w:r>
               <w:t>.676</w:t>
             </w:r>
@@ -1766,6 +1916,9 @@
         </w:tc>
       </w:tr>
       <w:tr>
+        <w:trPr>
+          <w:cantSplit/>
+        </w:trPr>
         <w:tc>
           <w:tcPr>
             <w:tcW w:type="dxa" w:w="1872"/>
@@ -1884,11 +2037,17 @@
         <w:gridCol w:w="1872"/>
       </w:tblGrid>
       <w:tr>
+        <w:trPr>
+          <w:cantSplit/>
+        </w:trPr>
         <w:tc>
           <w:tcPr>
             <w:tcW w:type="dxa" w:w="1872"/>
           </w:tcPr>
           <w:p>
+            <w:pPr>
+              <w:keepNext/>
+            </w:pPr>
             <w:r>
               <w:t>source</w:t>
             </w:r>
@@ -1899,6 +2058,9 @@
             <w:tcW w:type="dxa" w:w="1872"/>
           </w:tcPr>
           <w:p>
+            <w:pPr>
+              <w:keepNext/>
+            </w:pPr>
             <w:r>
               <w:t>df</w:t>
             </w:r>
@@ -1909,6 +2071,9 @@
             <w:tcW w:type="dxa" w:w="1872"/>
           </w:tcPr>
           <w:p>
+            <w:pPr>
+              <w:keepNext/>
+            </w:pPr>
             <w:r>
               <w:t>F</w:t>
             </w:r>
@@ -1919,6 +2084,9 @@
             <w:tcW w:type="dxa" w:w="1872"/>
           </w:tcPr>
           <w:p>
+            <w:pPr>
+              <w:keepNext/>
+            </w:pPr>
             <w:r>
               <w:t>p</w:t>
             </w:r>
@@ -1929,6 +2097,9 @@
             <w:tcW w:type="dxa" w:w="1872"/>
           </w:tcPr>
           <w:p>
+            <w:pPr>
+              <w:keepNext/>
+            </w:pPr>
             <w:r>
               <w:t>η²</w:t>
             </w:r>
@@ -1936,11 +2107,17 @@
         </w:tc>
       </w:tr>
       <w:tr>
+        <w:trPr>
+          <w:cantSplit/>
+        </w:trPr>
         <w:tc>
           <w:tcPr>
             <w:tcW w:type="dxa" w:w="1872"/>
           </w:tcPr>
           <w:p>
+            <w:pPr>
+              <w:keepNext/>
+            </w:pPr>
             <w:r>
               <w:t>representation</w:t>
             </w:r>
@@ -1951,6 +2128,9 @@
             <w:tcW w:type="dxa" w:w="1872"/>
           </w:tcPr>
           <w:p>
+            <w:pPr>
+              <w:keepNext/>
+            </w:pPr>
             <w:r>
               <w:t>3</w:t>
             </w:r>
@@ -1961,6 +2141,9 @@
             <w:tcW w:type="dxa" w:w="1872"/>
           </w:tcPr>
           <w:p>
+            <w:pPr>
+              <w:keepNext/>
+            </w:pPr>
             <w:r>
               <w:t>2.44</w:t>
             </w:r>
@@ -1971,6 +2154,9 @@
             <w:tcW w:type="dxa" w:w="1872"/>
           </w:tcPr>
           <w:p>
+            <w:pPr>
+              <w:keepNext/>
+            </w:pPr>
             <w:r>
               <w:t>.067</w:t>
             </w:r>
@@ -1981,6 +2167,9 @@
             <w:tcW w:type="dxa" w:w="1872"/>
           </w:tcPr>
           <w:p>
+            <w:pPr>
+              <w:keepNext/>
+            </w:pPr>
             <w:r>
               <w:t>.038</w:t>
             </w:r>
@@ -1988,11 +2177,17 @@
         </w:tc>
       </w:tr>
       <w:tr>
+        <w:trPr>
+          <w:cantSplit/>
+        </w:trPr>
         <w:tc>
           <w:tcPr>
             <w:tcW w:type="dxa" w:w="1872"/>
           </w:tcPr>
           <w:p>
+            <w:pPr>
+              <w:keepNext/>
+            </w:pPr>
             <w:r>
               <w:t>algorithm</w:t>
             </w:r>
@@ -2003,6 +2198,9 @@
             <w:tcW w:type="dxa" w:w="1872"/>
           </w:tcPr>
           <w:p>
+            <w:pPr>
+              <w:keepNext/>
+            </w:pPr>
             <w:r>
               <w:t>3</w:t>
             </w:r>
@@ -2013,6 +2211,9 @@
             <w:tcW w:type="dxa" w:w="1872"/>
           </w:tcPr>
           <w:p>
+            <w:pPr>
+              <w:keepNext/>
+            </w:pPr>
             <w:r>
               <w:t>9.05</w:t>
             </w:r>
@@ -2023,6 +2224,9 @@
             <w:tcW w:type="dxa" w:w="1872"/>
           </w:tcPr>
           <w:p>
+            <w:pPr>
+              <w:keepNext/>
+            </w:pPr>
             <w:r>
               <w:t>&lt;.0001</w:t>
             </w:r>
@@ -2033,6 +2237,9 @@
             <w:tcW w:type="dxa" w:w="1872"/>
           </w:tcPr>
           <w:p>
+            <w:pPr>
+              <w:keepNext/>
+            </w:pPr>
             <w:r>
               <w:t>.142</w:t>
             </w:r>
@@ -2040,11 +2247,17 @@
         </w:tc>
       </w:tr>
       <w:tr>
+        <w:trPr>
+          <w:cantSplit/>
+        </w:trPr>
         <w:tc>
           <w:tcPr>
             <w:tcW w:type="dxa" w:w="1872"/>
           </w:tcPr>
           <w:p>
+            <w:pPr>
+              <w:keepNext/>
+            </w:pPr>
             <w:r>
               <w:t>rep × algo</w:t>
             </w:r>
@@ -2055,6 +2268,9 @@
             <w:tcW w:type="dxa" w:w="1872"/>
           </w:tcPr>
           <w:p>
+            <w:pPr>
+              <w:keepNext/>
+            </w:pPr>
             <w:r>
               <w:t>9</w:t>
             </w:r>
@@ -2065,6 +2281,9 @@
             <w:tcW w:type="dxa" w:w="1872"/>
           </w:tcPr>
           <w:p>
+            <w:pPr>
+              <w:keepNext/>
+            </w:pPr>
             <w:r>
               <w:t>1.37</w:t>
             </w:r>
@@ -2075,6 +2294,9 @@
             <w:tcW w:type="dxa" w:w="1872"/>
           </w:tcPr>
           <w:p>
+            <w:pPr>
+              <w:keepNext/>
+            </w:pPr>
             <w:r>
               <w:t>.206</w:t>
             </w:r>
@@ -2085,6 +2307,9 @@
             <w:tcW w:type="dxa" w:w="1872"/>
           </w:tcPr>
           <w:p>
+            <w:pPr>
+              <w:keepNext/>
+            </w:pPr>
             <w:r>
               <w:t>.065</w:t>
             </w:r>
@@ -2092,6 +2317,9 @@
         </w:tc>
       </w:tr>
       <w:tr>
+        <w:trPr>
+          <w:cantSplit/>
+        </w:trPr>
         <w:tc>
           <w:tcPr>
             <w:tcW w:type="dxa" w:w="1872"/>
@@ -2193,11 +2421,17 @@
         <w:gridCol w:w="2340"/>
       </w:tblGrid>
       <w:tr>
+        <w:trPr>
+          <w:cantSplit/>
+        </w:trPr>
         <w:tc>
           <w:tcPr>
             <w:tcW w:type="dxa" w:w="2340"/>
           </w:tcPr>
           <w:p>
+            <w:pPr>
+              <w:keepNext/>
+            </w:pPr>
             <w:r>
               <w:t>algorithm</w:t>
             </w:r>
@@ -2208,6 +2442,9 @@
             <w:tcW w:type="dxa" w:w="2340"/>
           </w:tcPr>
           <w:p>
+            <w:pPr>
+              <w:keepNext/>
+            </w:pPr>
             <w:r>
               <w:t>Sharpe range</w:t>
             </w:r>
@@ -2218,6 +2455,9 @@
             <w:tcW w:type="dxa" w:w="2340"/>
           </w:tcPr>
           <w:p>
+            <w:pPr>
+              <w:keepNext/>
+            </w:pPr>
             <w:r>
               <w:t>CV</w:t>
             </w:r>
@@ -2228,6 +2468,9 @@
             <w:tcW w:type="dxa" w:w="2340"/>
           </w:tcPr>
           <w:p>
+            <w:pPr>
+              <w:keepNext/>
+            </w:pPr>
             <w:r>
               <w:t>mean divergence from behavior</w:t>
             </w:r>
@@ -2235,11 +2478,17 @@
         </w:tc>
       </w:tr>
       <w:tr>
+        <w:trPr>
+          <w:cantSplit/>
+        </w:trPr>
         <w:tc>
           <w:tcPr>
             <w:tcW w:type="dxa" w:w="2340"/>
           </w:tcPr>
           <w:p>
+            <w:pPr>
+              <w:keepNext/>
+            </w:pPr>
             <w:r>
               <w:t>BC</w:t>
             </w:r>
@@ -2250,6 +2499,9 @@
             <w:tcW w:type="dxa" w:w="2340"/>
           </w:tcPr>
           <w:p>
+            <w:pPr>
+              <w:keepNext/>
+            </w:pPr>
             <w:r>
               <w:t>.051</w:t>
             </w:r>
@@ -2260,6 +2512,9 @@
             <w:tcW w:type="dxa" w:w="2340"/>
           </w:tcPr>
           <w:p>
+            <w:pPr>
+              <w:keepNext/>
+            </w:pPr>
             <w:r>
               <w:t>.035</w:t>
             </w:r>
@@ -2270,6 +2525,9 @@
             <w:tcW w:type="dxa" w:w="2340"/>
           </w:tcPr>
           <w:p>
+            <w:pPr>
+              <w:keepNext/>
+            </w:pPr>
             <w:r>
               <w:t>.067</w:t>
             </w:r>
@@ -2277,11 +2535,17 @@
         </w:tc>
       </w:tr>
       <w:tr>
+        <w:trPr>
+          <w:cantSplit/>
+        </w:trPr>
         <w:tc>
           <w:tcPr>
             <w:tcW w:type="dxa" w:w="2340"/>
           </w:tcPr>
           <w:p>
+            <w:pPr>
+              <w:keepNext/>
+            </w:pPr>
             <w:r>
               <w:t>IQL</w:t>
             </w:r>
@@ -2292,6 +2556,9 @@
             <w:tcW w:type="dxa" w:w="2340"/>
           </w:tcPr>
           <w:p>
+            <w:pPr>
+              <w:keepNext/>
+            </w:pPr>
             <w:r>
               <w:t>.069</w:t>
             </w:r>
@@ -2302,6 +2569,9 @@
             <w:tcW w:type="dxa" w:w="2340"/>
           </w:tcPr>
           <w:p>
+            <w:pPr>
+              <w:keepNext/>
+            </w:pPr>
             <w:r>
               <w:t>.054</w:t>
             </w:r>
@@ -2312,6 +2582,9 @@
             <w:tcW w:type="dxa" w:w="2340"/>
           </w:tcPr>
           <w:p>
+            <w:pPr>
+              <w:keepNext/>
+            </w:pPr>
             <w:r>
               <w:t>.068</w:t>
             </w:r>
@@ -2319,11 +2592,17 @@
         </w:tc>
       </w:tr>
       <w:tr>
+        <w:trPr>
+          <w:cantSplit/>
+        </w:trPr>
         <w:tc>
           <w:tcPr>
             <w:tcW w:type="dxa" w:w="2340"/>
           </w:tcPr>
           <w:p>
+            <w:pPr>
+              <w:keepNext/>
+            </w:pPr>
             <w:r>
               <w:t>CQL</w:t>
             </w:r>
@@ -2334,6 +2613,9 @@
             <w:tcW w:type="dxa" w:w="2340"/>
           </w:tcPr>
           <w:p>
+            <w:pPr>
+              <w:keepNext/>
+            </w:pPr>
             <w:r>
               <w:t>.194</w:t>
             </w:r>
@@ -2344,6 +2626,9 @@
             <w:tcW w:type="dxa" w:w="2340"/>
           </w:tcPr>
           <w:p>
+            <w:pPr>
+              <w:keepNext/>
+            </w:pPr>
             <w:r>
               <w:t>.120</w:t>
             </w:r>
@@ -2354,6 +2639,9 @@
             <w:tcW w:type="dxa" w:w="2340"/>
           </w:tcPr>
           <w:p>
+            <w:pPr>
+              <w:keepNext/>
+            </w:pPr>
             <w:r>
               <w:t>.732</w:t>
             </w:r>
@@ -2361,6 +2649,9 @@
         </w:tc>
       </w:tr>
       <w:tr>
+        <w:trPr>
+          <w:cantSplit/>
+        </w:trPr>
         <w:tc>
           <w:tcPr>
             <w:tcW w:type="dxa" w:w="2340"/>
@@ -2691,11 +2982,17 @@
         <w:gridCol w:w="4680"/>
       </w:tblGrid>
       <w:tr>
+        <w:trPr>
+          <w:cantSplit/>
+        </w:trPr>
         <w:tc>
           <w:tcPr>
             <w:tcW w:type="dxa" w:w="4680"/>
           </w:tcPr>
           <w:p>
+            <w:pPr>
+              <w:keepNext/>
+            </w:pPr>
             <w:r>
               <w:t>policy (predictive / contrastive)</w:t>
             </w:r>
@@ -2706,6 +3003,9 @@
             <w:tcW w:type="dxa" w:w="4680"/>
           </w:tcPr>
           <w:p>
+            <w:pPr>
+              <w:keepNext/>
+            </w:pPr>
             <w:r>
               <w:t>test Sharpe, mean (std), 10 seeds</w:t>
             </w:r>
@@ -2713,11 +3013,17 @@
         </w:tc>
       </w:tr>
       <w:tr>
+        <w:trPr>
+          <w:cantSplit/>
+        </w:trPr>
         <w:tc>
           <w:tcPr>
             <w:tcW w:type="dxa" w:w="4680"/>
           </w:tcPr>
           <w:p>
+            <w:pPr>
+              <w:keepNext/>
+            </w:pPr>
             <w:r>
               <w:t>behavior clone (λ = 0)</w:t>
             </w:r>
@@ -2728,6 +3034,9 @@
             <w:tcW w:type="dxa" w:w="4680"/>
           </w:tcPr>
           <w:p>
+            <w:pPr>
+              <w:keepNext/>
+            </w:pPr>
             <w:r>
               <w:t>.725</w:t>
             </w:r>
@@ -2735,11 +3044,17 @@
         </w:tc>
       </w:tr>
       <w:tr>
+        <w:trPr>
+          <w:cantSplit/>
+        </w:trPr>
         <w:tc>
           <w:tcPr>
             <w:tcW w:type="dxa" w:w="4680"/>
           </w:tcPr>
           <w:p>
+            <w:pPr>
+              <w:keepNext/>
+            </w:pPr>
             <w:r>
               <w:t>A2C (full deviation)</w:t>
             </w:r>
@@ -2750,6 +3065,9 @@
             <w:tcW w:type="dxa" w:w="4680"/>
           </w:tcPr>
           <w:p>
+            <w:pPr>
+              <w:keepNext/>
+            </w:pPr>
             <w:r>
               <w:t>.617 (.09) / .527 (.39)</w:t>
             </w:r>
@@ -2757,11 +3075,17 @@
         </w:tc>
       </w:tr>
       <w:tr>
+        <w:trPr>
+          <w:cantSplit/>
+        </w:trPr>
         <w:tc>
           <w:tcPr>
             <w:tcW w:type="dxa" w:w="4680"/>
           </w:tcPr>
           <w:p>
+            <w:pPr>
+              <w:keepNext/>
+            </w:pPr>
             <w:r>
               <w:t>gated, ρ = 0</w:t>
             </w:r>
@@ -2772,6 +3096,9 @@
             <w:tcW w:type="dxa" w:w="4680"/>
           </w:tcPr>
           <w:p>
+            <w:pPr>
+              <w:keepNext/>
+            </w:pPr>
             <w:r>
               <w:t>.782 (.23) / .784 (.19)</w:t>
             </w:r>
@@ -2779,11 +3106,17 @@
         </w:tc>
       </w:tr>
       <w:tr>
+        <w:trPr>
+          <w:cantSplit/>
+        </w:trPr>
         <w:tc>
           <w:tcPr>
             <w:tcW w:type="dxa" w:w="4680"/>
           </w:tcPr>
           <w:p>
+            <w:pPr>
+              <w:keepNext/>
+            </w:pPr>
             <w:r>
               <w:t>gated, ρ = 1 (proposed)</w:t>
             </w:r>
@@ -2794,6 +3127,9 @@
             <w:tcW w:type="dxa" w:w="4680"/>
           </w:tcPr>
           <w:p>
+            <w:pPr>
+              <w:keepNext/>
+            </w:pPr>
             <w:r>
               <w:t>.757 (.06) / .759 (.06)</w:t>
             </w:r>
@@ -2801,6 +3137,9 @@
         </w:tc>
       </w:tr>
       <w:tr>
+        <w:trPr>
+          <w:cantSplit/>
+        </w:trPr>
         <w:tc>
           <w:tcPr>
             <w:tcW w:type="dxa" w:w="4680"/>
@@ -2961,11 +3300,17 @@
         <w:gridCol w:w="1337"/>
       </w:tblGrid>
       <w:tr>
+        <w:trPr>
+          <w:cantSplit/>
+        </w:trPr>
         <w:tc>
           <w:tcPr>
             <w:tcW w:type="dxa" w:w="1337"/>
           </w:tcPr>
           <w:p>
+            <w:pPr>
+              <w:keepNext/>
+            </w:pPr>
             <w:r>
               <w:t>policy</w:t>
             </w:r>
@@ -2976,6 +3321,9 @@
             <w:tcW w:type="dxa" w:w="1337"/>
           </w:tcPr>
           <w:p>
+            <w:pPr>
+              <w:keepNext/>
+            </w:pPr>
             <w:r>
               <w:t>Sharpe</w:t>
             </w:r>
@@ -2986,6 +3334,9 @@
             <w:tcW w:type="dxa" w:w="1337"/>
           </w:tcPr>
           <w:p>
+            <w:pPr>
+              <w:keepNext/>
+            </w:pPr>
             <w:r>
               <w:t>exposure</w:t>
             </w:r>
@@ -2996,6 +3347,9 @@
             <w:tcW w:type="dxa" w:w="1337"/>
           </w:tcPr>
           <w:p>
+            <w:pPr>
+              <w:keepNext/>
+            </w:pPr>
             <w:r>
               <w:t>dir_acc</w:t>
             </w:r>
@@ -3006,6 +3360,9 @@
             <w:tcW w:type="dxa" w:w="1337"/>
           </w:tcPr>
           <w:p>
+            <w:pPr>
+              <w:keepNext/>
+            </w:pPr>
             <w:r>
               <w:t>upside capture</w:t>
             </w:r>
@@ -3016,6 +3373,9 @@
             <w:tcW w:type="dxa" w:w="1337"/>
           </w:tcPr>
           <w:p>
+            <w:pPr>
+              <w:keepNext/>
+            </w:pPr>
             <w:r>
               <w:t>downside loss</w:t>
             </w:r>
@@ -3026,6 +3386,9 @@
             <w:tcW w:type="dxa" w:w="1337"/>
           </w:tcPr>
           <w:p>
+            <w:pPr>
+              <w:keepNext/>
+            </w:pPr>
             <w:r>
               <w:t>Δ vs BH</w:t>
             </w:r>
@@ -3033,11 +3396,17 @@
         </w:tc>
       </w:tr>
       <w:tr>
+        <w:trPr>
+          <w:cantSplit/>
+        </w:trPr>
         <w:tc>
           <w:tcPr>
             <w:tcW w:type="dxa" w:w="1337"/>
           </w:tcPr>
           <w:p>
+            <w:pPr>
+              <w:keepNext/>
+            </w:pPr>
             <w:r>
               <w:t>buy-and-hold (SPY/CSI300/NIFTY)</w:t>
             </w:r>
@@ -3048,6 +3417,9 @@
             <w:tcW w:type="dxa" w:w="1337"/>
           </w:tcPr>
           <w:p>
+            <w:pPr>
+              <w:keepNext/>
+            </w:pPr>
             <w:r>
               <w:t>.784 / −.352 / 1.006</w:t>
             </w:r>
@@ -3058,6 +3430,9 @@
             <w:tcW w:type="dxa" w:w="1337"/>
           </w:tcPr>
           <w:p>
+            <w:pPr>
+              <w:keepNext/>
+            </w:pPr>
             <w:r>
               <w:t>1.00</w:t>
             </w:r>
@@ -3068,6 +3443,9 @@
             <w:tcW w:type="dxa" w:w="1337"/>
           </w:tcPr>
           <w:p>
+            <w:pPr>
+              <w:keepNext/>
+            </w:pPr>
             <w:r>
               <w:t>.54 / .48 / .54</w:t>
             </w:r>
@@ -3078,6 +3456,9 @@
             <w:tcW w:type="dxa" w:w="1337"/>
           </w:tcPr>
           <w:p>
+            <w:pPr>
+              <w:keepNext/>
+            </w:pPr>
             <w:r>
               <w:t>1.00</w:t>
             </w:r>
@@ -3088,6 +3469,9 @@
             <w:tcW w:type="dxa" w:w="1337"/>
           </w:tcPr>
           <w:p>
+            <w:pPr>
+              <w:keepNext/>
+            </w:pPr>
             <w:r>
               <w:t>1.00</w:t>
             </w:r>
@@ -3098,6 +3482,9 @@
             <w:tcW w:type="dxa" w:w="1337"/>
           </w:tcPr>
           <w:p>
+            <w:pPr>
+              <w:keepNext/>
+            </w:pPr>
             <w:r>
               <w:t>0</w:t>
             </w:r>
@@ -3105,11 +3492,17 @@
         </w:tc>
       </w:tr>
       <w:tr>
+        <w:trPr>
+          <w:cantSplit/>
+        </w:trPr>
         <w:tc>
           <w:tcPr>
             <w:tcW w:type="dxa" w:w="1337"/>
           </w:tcPr>
           <w:p>
+            <w:pPr>
+              <w:keepNext/>
+            </w:pPr>
             <w:r>
               <w:t>A2C</w:t>
             </w:r>
@@ -3120,6 +3513,9 @@
             <w:tcW w:type="dxa" w:w="1337"/>
           </w:tcPr>
           <w:p>
+            <w:pPr>
+              <w:keepNext/>
+            </w:pPr>
             <w:r>
               <w:t>.692 / −.015 / .718</w:t>
             </w:r>
@@ -3130,6 +3526,9 @@
             <w:tcW w:type="dxa" w:w="1337"/>
           </w:tcPr>
           <w:p>
+            <w:pPr>
+              <w:keepNext/>
+            </w:pPr>
             <w:r>
               <w:t>.15 / .31 / .40</w:t>
             </w:r>
@@ -3140,6 +3539,9 @@
             <w:tcW w:type="dxa" w:w="1337"/>
           </w:tcPr>
           <w:p>
+            <w:pPr>
+              <w:keepNext/>
+            </w:pPr>
             <w:r>
               <w:t>.53 / .48 / .51</w:t>
             </w:r>
@@ -3150,6 +3552,9 @@
             <w:tcW w:type="dxa" w:w="1337"/>
           </w:tcPr>
           <w:p>
+            <w:pPr>
+              <w:keepNext/>
+            </w:pPr>
             <w:r>
               <w:t>.17 / .34 / .44</w:t>
             </w:r>
@@ -3160,6 +3565,9 @@
             <w:tcW w:type="dxa" w:w="1337"/>
           </w:tcPr>
           <w:p>
+            <w:pPr>
+              <w:keepNext/>
+            </w:pPr>
             <w:r>
               <w:t>.17 / .32 / .44</w:t>
             </w:r>
@@ -3170,6 +3578,9 @@
             <w:tcW w:type="dxa" w:w="1337"/>
           </w:tcPr>
           <w:p>
+            <w:pPr>
+              <w:keepNext/>
+            </w:pPr>
             <w:r>
               <w:t>−.09 / +.34 / −.29</w:t>
             </w:r>
@@ -3177,11 +3588,17 @@
         </w:tc>
       </w:tr>
       <w:tr>
+        <w:trPr>
+          <w:cantSplit/>
+        </w:trPr>
         <w:tc>
           <w:tcPr>
             <w:tcW w:type="dxa" w:w="1337"/>
           </w:tcPr>
           <w:p>
+            <w:pPr>
+              <w:keepNext/>
+            </w:pPr>
             <w:r>
               <w:t>BC</w:t>
             </w:r>
@@ -3192,6 +3609,9 @@
             <w:tcW w:type="dxa" w:w="1337"/>
           </w:tcPr>
           <w:p>
+            <w:pPr>
+              <w:keepNext/>
+            </w:pPr>
             <w:r>
               <w:t>.631 / −.119 / .571</w:t>
             </w:r>
@@ -3202,6 +3622,9 @@
             <w:tcW w:type="dxa" w:w="1337"/>
           </w:tcPr>
           <w:p>
+            <w:pPr>
+              <w:keepNext/>
+            </w:pPr>
             <w:r>
               <w:t>.15 / .16 / .12</w:t>
             </w:r>
@@ -3212,6 +3635,9 @@
             <w:tcW w:type="dxa" w:w="1337"/>
           </w:tcPr>
           <w:p>
+            <w:pPr>
+              <w:keepNext/>
+            </w:pPr>
             <w:r>
               <w:t>.52 / .48 / .47</w:t>
             </w:r>
@@ -3222,6 +3648,9 @@
             <w:tcW w:type="dxa" w:w="1337"/>
           </w:tcPr>
           <w:p>
+            <w:pPr>
+              <w:keepNext/>
+            </w:pPr>
             <w:r>
               <w:t>.10 / .07 / .10</w:t>
             </w:r>
@@ -3232,6 +3661,9 @@
             <w:tcW w:type="dxa" w:w="1337"/>
           </w:tcPr>
           <w:p>
+            <w:pPr>
+              <w:keepNext/>
+            </w:pPr>
             <w:r>
               <w:t>.09 / .07 / .10</w:t>
             </w:r>
@@ -3242,6 +3674,9 @@
             <w:tcW w:type="dxa" w:w="1337"/>
           </w:tcPr>
           <w:p>
+            <w:pPr>
+              <w:keepNext/>
+            </w:pPr>
             <w:r>
               <w:t>−.15 / +.23 / −.44</w:t>
             </w:r>
@@ -3249,11 +3684,17 @@
         </w:tc>
       </w:tr>
       <w:tr>
+        <w:trPr>
+          <w:cantSplit/>
+        </w:trPr>
         <w:tc>
           <w:tcPr>
             <w:tcW w:type="dxa" w:w="1337"/>
           </w:tcPr>
           <w:p>
+            <w:pPr>
+              <w:keepNext/>
+            </w:pPr>
             <w:r>
               <w:t>IQL</w:t>
             </w:r>
@@ -3264,6 +3705,9 @@
             <w:tcW w:type="dxa" w:w="1337"/>
           </w:tcPr>
           <w:p>
+            <w:pPr>
+              <w:keepNext/>
+            </w:pPr>
             <w:r>
               <w:t>.629 / −.099 / .463</w:t>
             </w:r>
@@ -3274,6 +3718,9 @@
             <w:tcW w:type="dxa" w:w="1337"/>
           </w:tcPr>
           <w:p>
+            <w:pPr>
+              <w:keepNext/>
+            </w:pPr>
             <w:r>
               <w:t>.16 / .17 / .15</w:t>
             </w:r>
@@ -3284,6 +3731,9 @@
             <w:tcW w:type="dxa" w:w="1337"/>
           </w:tcPr>
           <w:p>
+            <w:pPr>
+              <w:keepNext/>
+            </w:pPr>
             <w:r>
               <w:t>.52 / .50 / .47</w:t>
             </w:r>
@@ -3294,6 +3744,9 @@
             <w:tcW w:type="dxa" w:w="1337"/>
           </w:tcPr>
           <w:p>
+            <w:pPr>
+              <w:keepNext/>
+            </w:pPr>
             <w:r>
               <w:t>.10 / .07 / .09</w:t>
             </w:r>
@@ -3304,6 +3757,9 @@
             <w:tcW w:type="dxa" w:w="1337"/>
           </w:tcPr>
           <w:p>
+            <w:pPr>
+              <w:keepNext/>
+            </w:pPr>
             <w:r>
               <w:t>.09 / .07 / .09</w:t>
             </w:r>
@@ -3314,6 +3770,9 @@
             <w:tcW w:type="dxa" w:w="1337"/>
           </w:tcPr>
           <w:p>
+            <w:pPr>
+              <w:keepNext/>
+            </w:pPr>
             <w:r>
               <w:t>−.16 / +.25 / −.54</w:t>
             </w:r>
@@ -3321,11 +3780,17 @@
         </w:tc>
       </w:tr>
       <w:tr>
+        <w:trPr>
+          <w:cantSplit/>
+        </w:trPr>
         <w:tc>
           <w:tcPr>
             <w:tcW w:type="dxa" w:w="1337"/>
           </w:tcPr>
           <w:p>
+            <w:pPr>
+              <w:keepNext/>
+            </w:pPr>
             <w:r>
               <w:t>CQL</w:t>
             </w:r>
@@ -3336,6 +3801,9 @@
             <w:tcW w:type="dxa" w:w="1337"/>
           </w:tcPr>
           <w:p>
+            <w:pPr>
+              <w:keepNext/>
+            </w:pPr>
             <w:r>
               <w:t>.696 / −.316 / .630</w:t>
             </w:r>
@@ -3346,6 +3814,9 @@
             <w:tcW w:type="dxa" w:w="1337"/>
           </w:tcPr>
           <w:p>
+            <w:pPr>
+              <w:keepNext/>
+            </w:pPr>
             <w:r>
               <w:t>.77 / .40 / .26</w:t>
             </w:r>
@@ -3356,6 +3827,9 @@
             <w:tcW w:type="dxa" w:w="1337"/>
           </w:tcPr>
           <w:p>
+            <w:pPr>
+              <w:keepNext/>
+            </w:pPr>
             <w:r>
               <w:t>.53 / .48 / .50</w:t>
             </w:r>
@@ -3366,6 +3840,9 @@
             <w:tcW w:type="dxa" w:w="1337"/>
           </w:tcPr>
           <w:p>
+            <w:pPr>
+              <w:keepNext/>
+            </w:pPr>
             <w:r>
               <w:t>.78 / .22 / .24</w:t>
             </w:r>
@@ -3376,6 +3853,9 @@
             <w:tcW w:type="dxa" w:w="1337"/>
           </w:tcPr>
           <w:p>
+            <w:pPr>
+              <w:keepNext/>
+            </w:pPr>
             <w:r>
               <w:t>.78 / .24 / .24</w:t>
             </w:r>
@@ -3386,6 +3866,9 @@
             <w:tcW w:type="dxa" w:w="1337"/>
           </w:tcPr>
           <w:p>
+            <w:pPr>
+              <w:keepNext/>
+            </w:pPr>
             <w:r>
               <w:t>−.09 / +.04 / −.38</w:t>
             </w:r>
@@ -3393,11 +3876,17 @@
         </w:tc>
       </w:tr>
       <w:tr>
+        <w:trPr>
+          <w:cantSplit/>
+        </w:trPr>
         <w:tc>
           <w:tcPr>
             <w:tcW w:type="dxa" w:w="1337"/>
           </w:tcPr>
           <w:p>
+            <w:pPr>
+              <w:keepNext/>
+            </w:pPr>
             <w:r>
               <w:t>gated (proposed)</w:t>
             </w:r>
@@ -3408,6 +3897,9 @@
             <w:tcW w:type="dxa" w:w="1337"/>
           </w:tcPr>
           <w:p>
+            <w:pPr>
+              <w:keepNext/>
+            </w:pPr>
             <w:r>
               <w:t>.741 / −.381 / .518</w:t>
             </w:r>
@@ -3418,6 +3910,9 @@
             <w:tcW w:type="dxa" w:w="1337"/>
           </w:tcPr>
           <w:p>
+            <w:pPr>
+              <w:keepNext/>
+            </w:pPr>
             <w:r>
               <w:t>.16 / .17 / .16</w:t>
             </w:r>
@@ -3428,6 +3923,9 @@
             <w:tcW w:type="dxa" w:w="1337"/>
           </w:tcPr>
           <w:p>
+            <w:pPr>
+              <w:keepNext/>
+            </w:pPr>
             <w:r>
               <w:t>.52 / .51 / .48</w:t>
             </w:r>
@@ -3438,6 +3936,9 @@
             <w:tcW w:type="dxa" w:w="1337"/>
           </w:tcPr>
           <w:p>
+            <w:pPr>
+              <w:keepNext/>
+            </w:pPr>
             <w:r>
               <w:t>.10 / .05 / .12</w:t>
             </w:r>
@@ -3448,6 +3949,9 @@
             <w:tcW w:type="dxa" w:w="1337"/>
           </w:tcPr>
           <w:p>
+            <w:pPr>
+              <w:keepNext/>
+            </w:pPr>
             <w:r>
               <w:t>.08 / .06 / .12</w:t>
             </w:r>
@@ -3458,6 +3962,9 @@
             <w:tcW w:type="dxa" w:w="1337"/>
           </w:tcPr>
           <w:p>
+            <w:pPr>
+              <w:keepNext/>
+            </w:pPr>
             <w:r>
               <w:t>−.04 / −.03 / −.49</w:t>
             </w:r>
@@ -3465,6 +3972,9 @@
         </w:tc>
       </w:tr>
       <w:tr>
+        <w:trPr>
+          <w:cantSplit/>
+        </w:trPr>
         <w:tc>
           <w:tcPr>
             <w:tcW w:type="dxa" w:w="1337"/>
@@ -3774,11 +4284,17 @@
         <w:gridCol w:w="1872"/>
       </w:tblGrid>
       <w:tr>
+        <w:trPr>
+          <w:cantSplit/>
+        </w:trPr>
         <w:tc>
           <w:tcPr>
             <w:tcW w:type="dxa" w:w="1872"/>
           </w:tcPr>
           <w:p>
+            <w:pPr>
+              <w:keepNext/>
+            </w:pPr>
             <w:r>
               <w:t>policy (SPY / CSI300 / NIFTY)</w:t>
             </w:r>
@@ -3789,6 +4305,9 @@
             <w:tcW w:type="dxa" w:w="1872"/>
           </w:tcPr>
           <w:p>
+            <w:pPr>
+              <w:keepNext/>
+            </w:pPr>
             <w:r>
               <w:t>Sharpe</w:t>
             </w:r>
@@ -3799,6 +4318,9 @@
             <w:tcW w:type="dxa" w:w="1872"/>
           </w:tcPr>
           <w:p>
+            <w:pPr>
+              <w:keepNext/>
+            </w:pPr>
             <w:r>
               <w:t>return</w:t>
             </w:r>
@@ -3809,6 +4331,9 @@
             <w:tcW w:type="dxa" w:w="1872"/>
           </w:tcPr>
           <w:p>
+            <w:pPr>
+              <w:keepNext/>
+            </w:pPr>
             <w:r>
               <w:t>maxDD</w:t>
             </w:r>
@@ -3819,6 +4344,9 @@
             <w:tcW w:type="dxa" w:w="1872"/>
           </w:tcPr>
           <w:p>
+            <w:pPr>
+              <w:keepNext/>
+            </w:pPr>
             <w:r>
               <w:t>exposure</w:t>
             </w:r>
@@ -3826,11 +4354,17 @@
         </w:tc>
       </w:tr>
       <w:tr>
+        <w:trPr>
+          <w:cantSplit/>
+        </w:trPr>
         <w:tc>
           <w:tcPr>
             <w:tcW w:type="dxa" w:w="1872"/>
           </w:tcPr>
           <w:p>
+            <w:pPr>
+              <w:keepNext/>
+            </w:pPr>
             <w:r>
               <w:t>buy-and-hold</w:t>
             </w:r>
@@ -3841,6 +4375,9 @@
             <w:tcW w:type="dxa" w:w="1872"/>
           </w:tcPr>
           <w:p>
+            <w:pPr>
+              <w:keepNext/>
+            </w:pPr>
             <w:r>
               <w:t>.784 / −.352 / 1.006</w:t>
             </w:r>
@@ -3851,6 +4388,9 @@
             <w:tcW w:type="dxa" w:w="1872"/>
           </w:tcPr>
           <w:p>
+            <w:pPr>
+              <w:keepNext/>
+            </w:pPr>
             <w:r>
               <w:t>.586 / −.275 / .694</w:t>
             </w:r>
@@ -3861,6 +4401,9 @@
             <w:tcW w:type="dxa" w:w="1872"/>
           </w:tcPr>
           <w:p>
+            <w:pPr>
+              <w:keepNext/>
+            </w:pPr>
             <w:r>
               <w:t>−.253 / −.456 / −.172</w:t>
             </w:r>
@@ -3871,6 +4414,9 @@
             <w:tcW w:type="dxa" w:w="1872"/>
           </w:tcPr>
           <w:p>
+            <w:pPr>
+              <w:keepNext/>
+            </w:pPr>
             <w:r>
               <w:t>1.00</w:t>
             </w:r>
@@ -3878,11 +4424,17 @@
         </w:tc>
       </w:tr>
       <w:tr>
+        <w:trPr>
+          <w:cantSplit/>
+        </w:trPr>
         <w:tc>
           <w:tcPr>
             <w:tcW w:type="dxa" w:w="1872"/>
           </w:tcPr>
           <w:p>
+            <w:pPr>
+              <w:keepNext/>
+            </w:pPr>
             <w:r>
               <w:t>constant at learned mean</w:t>
             </w:r>
@@ -3893,6 +4445,9 @@
             <w:tcW w:type="dxa" w:w="1872"/>
           </w:tcPr>
           <w:p>
+            <w:pPr>
+              <w:keepNext/>
+            </w:pPr>
             <w:r>
               <w:t>.784 / −.352 / 1.006</w:t>
             </w:r>
@@ -3903,6 +4458,9 @@
             <w:tcW w:type="dxa" w:w="1872"/>
           </w:tcPr>
           <w:p>
+            <w:pPr>
+              <w:keepNext/>
+            </w:pPr>
             <w:r>
               <w:t>.262 / −.133 / .281</w:t>
             </w:r>
@@ -3913,6 +4471,9 @@
             <w:tcW w:type="dxa" w:w="1872"/>
           </w:tcPr>
           <w:p>
+            <w:pPr>
+              <w:keepNext/>
+            </w:pPr>
             <w:r>
               <w:t>−.125 / −.252 / −.079</w:t>
             </w:r>
@@ -3923,6 +4484,9 @@
             <w:tcW w:type="dxa" w:w="1872"/>
           </w:tcPr>
           <w:p>
+            <w:pPr>
+              <w:keepNext/>
+            </w:pPr>
             <w:r>
               <w:t>.48</w:t>
             </w:r>
@@ -3930,11 +4494,17 @@
         </w:tc>
       </w:tr>
       <w:tr>
+        <w:trPr>
+          <w:cantSplit/>
+        </w:trPr>
         <w:tc>
           <w:tcPr>
             <w:tcW w:type="dxa" w:w="1872"/>
           </w:tcPr>
           <w:p>
+            <w:pPr>
+              <w:keepNext/>
+            </w:pPr>
             <w:r>
               <w:t>exposure, max Sharpe</w:t>
             </w:r>
@@ -3945,6 +4515,9 @@
             <w:tcW w:type="dxa" w:w="1872"/>
           </w:tcPr>
           <w:p>
+            <w:pPr>
+              <w:keepNext/>
+            </w:pPr>
             <w:r>
               <w:t>.909 / −.355 / 1.033</w:t>
             </w:r>
@@ -3955,6 +4528,9 @@
             <w:tcW w:type="dxa" w:w="1872"/>
           </w:tcPr>
           <w:p>
+            <w:pPr>
+              <w:keepNext/>
+            </w:pPr>
             <w:r>
               <w:t>.309 / −.135 / .271</w:t>
             </w:r>
@@ -3965,6 +4541,9 @@
             <w:tcW w:type="dxa" w:w="1872"/>
           </w:tcPr>
           <w:p>
+            <w:pPr>
+              <w:keepNext/>
+            </w:pPr>
             <w:r>
               <w:t>−.114 / −.253 / −.081</w:t>
             </w:r>
@@ -3975,6 +4554,9 @@
             <w:tcW w:type="dxa" w:w="1872"/>
           </w:tcPr>
           <w:p>
+            <w:pPr>
+              <w:keepNext/>
+            </w:pPr>
             <w:r>
               <w:t>.48</w:t>
             </w:r>
@@ -3982,6 +4564,9 @@
         </w:tc>
       </w:tr>
       <w:tr>
+        <w:trPr>
+          <w:cantSplit/>
+        </w:trPr>
         <w:tc>
           <w:tcPr>
             <w:tcW w:type="dxa" w:w="1872"/>
@@ -4215,11 +4800,17 @@
         <w:gridCol w:w="1872"/>
       </w:tblGrid>
       <w:tr>
+        <w:trPr>
+          <w:cantSplit/>
+        </w:trPr>
         <w:tc>
           <w:tcPr>
             <w:tcW w:type="dxa" w:w="1872"/>
           </w:tcPr>
           <w:p>
+            <w:pPr>
+              <w:keepNext/>
+            </w:pPr>
             <w:r>
               <w:t>driver</w:t>
             </w:r>
@@ -4230,6 +4821,9 @@
             <w:tcW w:type="dxa" w:w="1872"/>
           </w:tcPr>
           <w:p>
+            <w:pPr>
+              <w:keepNext/>
+            </w:pPr>
             <w:r>
               <w:t>SPY corr(e,·)</w:t>
             </w:r>
@@ -4240,6 +4834,9 @@
             <w:tcW w:type="dxa" w:w="1872"/>
           </w:tcPr>
           <w:p>
+            <w:pPr>
+              <w:keepNext/>
+            </w:pPr>
             <w:r>
               <w:t>SPY OLS β</w:t>
             </w:r>
@@ -4250,6 +4847,9 @@
             <w:tcW w:type="dxa" w:w="1872"/>
           </w:tcPr>
           <w:p>
+            <w:pPr>
+              <w:keepNext/>
+            </w:pPr>
             <w:r>
               <w:t>NIFTY corr(e,·)</w:t>
             </w:r>
@@ -4260,6 +4860,9 @@
             <w:tcW w:type="dxa" w:w="1872"/>
           </w:tcPr>
           <w:p>
+            <w:pPr>
+              <w:keepNext/>
+            </w:pPr>
             <w:r>
               <w:t>NIFTY OLS β</w:t>
             </w:r>
@@ -4267,11 +4870,17 @@
         </w:tc>
       </w:tr>
       <w:tr>
+        <w:trPr>
+          <w:cantSplit/>
+        </w:trPr>
         <w:tc>
           <w:tcPr>
             <w:tcW w:type="dxa" w:w="1872"/>
           </w:tcPr>
           <w:p>
+            <w:pPr>
+              <w:keepNext/>
+            </w:pPr>
             <w:r>
               <w:t>next-day return</w:t>
             </w:r>
@@ -4282,6 +4891,9 @@
             <w:tcW w:type="dxa" w:w="1872"/>
           </w:tcPr>
           <w:p>
+            <w:pPr>
+              <w:keepNext/>
+            </w:pPr>
             <w:r>
               <w:t>+.05</w:t>
             </w:r>
@@ -4292,6 +4904,9 @@
             <w:tcW w:type="dxa" w:w="1872"/>
           </w:tcPr>
           <w:p>
+            <w:pPr>
+              <w:keepNext/>
+            </w:pPr>
             <w:r>
               <w:t>–</w:t>
             </w:r>
@@ -4302,6 +4917,9 @@
             <w:tcW w:type="dxa" w:w="1872"/>
           </w:tcPr>
           <w:p>
+            <w:pPr>
+              <w:keepNext/>
+            </w:pPr>
             <w:r>
               <w:t>−.01</w:t>
             </w:r>
@@ -4312,6 +4930,9 @@
             <w:tcW w:type="dxa" w:w="1872"/>
           </w:tcPr>
           <w:p>
+            <w:pPr>
+              <w:keepNext/>
+            </w:pPr>
             <w:r>
               <w:t>–</w:t>
             </w:r>
@@ -4319,11 +4940,17 @@
         </w:tc>
       </w:tr>
       <w:tr>
+        <w:trPr>
+          <w:cantSplit/>
+        </w:trPr>
         <w:tc>
           <w:tcPr>
             <w:tcW w:type="dxa" w:w="1872"/>
           </w:tcPr>
           <w:p>
+            <w:pPr>
+              <w:keepNext/>
+            </w:pPr>
             <w:r>
               <w:t>realized vol (z)</w:t>
             </w:r>
@@ -4334,6 +4961,9 @@
             <w:tcW w:type="dxa" w:w="1872"/>
           </w:tcPr>
           <w:p>
+            <w:pPr>
+              <w:keepNext/>
+            </w:pPr>
             <w:r>
               <w:t>−.29</w:t>
             </w:r>
@@ -4344,6 +4974,9 @@
             <w:tcW w:type="dxa" w:w="1872"/>
           </w:tcPr>
           <w:p>
+            <w:pPr>
+              <w:keepNext/>
+            </w:pPr>
             <w:r>
               <w:t>−.040</w:t>
             </w:r>
@@ -4354,6 +4987,9 @@
             <w:tcW w:type="dxa" w:w="1872"/>
           </w:tcPr>
           <w:p>
+            <w:pPr>
+              <w:keepNext/>
+            </w:pPr>
             <w:r>
               <w:t>−.34</w:t>
             </w:r>
@@ -4364,6 +5000,9 @@
             <w:tcW w:type="dxa" w:w="1872"/>
           </w:tcPr>
           <w:p>
+            <w:pPr>
+              <w:keepNext/>
+            </w:pPr>
             <w:r>
               <w:t>−.014</w:t>
             </w:r>
@@ -4371,11 +5010,17 @@
         </w:tc>
       </w:tr>
       <w:tr>
+        <w:trPr>
+          <w:cantSplit/>
+        </w:trPr>
         <w:tc>
           <w:tcPr>
             <w:tcW w:type="dxa" w:w="1872"/>
           </w:tcPr>
           <w:p>
+            <w:pPr>
+              <w:keepNext/>
+            </w:pPr>
             <w:r/>
           </w:p>
         </w:tc>
@@ -4384,6 +5029,9 @@
             <w:tcW w:type="dxa" w:w="1872"/>
           </w:tcPr>
           <w:p>
+            <w:pPr>
+              <w:keepNext/>
+            </w:pPr>
             <w:r>
               <w:t>next-day return</w:t>
             </w:r>
@@ -4394,6 +5042,9 @@
             <w:tcW w:type="dxa" w:w="1872"/>
           </w:tcPr>
           <w:p>
+            <w:pPr>
+              <w:keepNext/>
+            </w:pPr>
             <w:r/>
           </w:p>
         </w:tc>
@@ -4402,6 +5053,9 @@
             <w:tcW w:type="dxa" w:w="1872"/>
           </w:tcPr>
           <w:p>
+            <w:pPr>
+              <w:keepNext/>
+            </w:pPr>
             <w:r>
               <w:t>−.10</w:t>
             </w:r>
@@ -4412,6 +5066,9 @@
             <w:tcW w:type="dxa" w:w="1872"/>
           </w:tcPr>
           <w:p>
+            <w:pPr>
+              <w:keepNext/>
+            </w:pPr>
             <w:r>
               <w:t>–</w:t>
             </w:r>
@@ -4419,11 +5076,17 @@
         </w:tc>
       </w:tr>
       <w:tr>
+        <w:trPr>
+          <w:cantSplit/>
+        </w:trPr>
         <w:tc>
           <w:tcPr>
             <w:tcW w:type="dxa" w:w="1872"/>
           </w:tcPr>
           <w:p>
+            <w:pPr>
+              <w:keepNext/>
+            </w:pPr>
             <w:r>
               <w:t>forward 5d vol</w:t>
             </w:r>
@@ -4434,6 +5097,9 @@
             <w:tcW w:type="dxa" w:w="1872"/>
           </w:tcPr>
           <w:p>
+            <w:pPr>
+              <w:keepNext/>
+            </w:pPr>
             <w:r>
               <w:t>−.03</w:t>
             </w:r>
@@ -4444,6 +5110,9 @@
             <w:tcW w:type="dxa" w:w="1872"/>
           </w:tcPr>
           <w:p>
+            <w:pPr>
+              <w:keepNext/>
+            </w:pPr>
             <w:r>
               <w:t>–</w:t>
             </w:r>
@@ -4454,6 +5123,9 @@
             <w:tcW w:type="dxa" w:w="1872"/>
           </w:tcPr>
           <w:p>
+            <w:pPr>
+              <w:keepNext/>
+            </w:pPr>
             <w:r>
               <w:t>−.21</w:t>
             </w:r>
@@ -4464,6 +5136,9 @@
             <w:tcW w:type="dxa" w:w="1872"/>
           </w:tcPr>
           <w:p>
+            <w:pPr>
+              <w:keepNext/>
+            </w:pPr>
             <w:r>
               <w:t>–</w:t>
             </w:r>
@@ -4471,11 +5146,17 @@
         </w:tc>
       </w:tr>
       <w:tr>
+        <w:trPr>
+          <w:cantSplit/>
+        </w:trPr>
         <w:tc>
           <w:tcPr>
             <w:tcW w:type="dxa" w:w="1872"/>
           </w:tcPr>
           <w:p>
+            <w:pPr>
+              <w:keepNext/>
+            </w:pPr>
             <w:r>
               <w:t>OOD distance (Mahalanobis)</w:t>
             </w:r>
@@ -4486,6 +5167,9 @@
             <w:tcW w:type="dxa" w:w="1872"/>
           </w:tcPr>
           <w:p>
+            <w:pPr>
+              <w:keepNext/>
+            </w:pPr>
             <w:r>
               <w:t>−.25</w:t>
             </w:r>
@@ -4496,6 +5180,9 @@
             <w:tcW w:type="dxa" w:w="1872"/>
           </w:tcPr>
           <w:p>
+            <w:pPr>
+              <w:keepNext/>
+            </w:pPr>
             <w:r>
               <w:t>−.022</w:t>
             </w:r>
@@ -4506,6 +5193,9 @@
             <w:tcW w:type="dxa" w:w="1872"/>
           </w:tcPr>
           <w:p>
+            <w:pPr>
+              <w:keepNext/>
+            </w:pPr>
             <w:r>
               <w:t>−.33</w:t>
             </w:r>
@@ -4516,6 +5206,9 @@
             <w:tcW w:type="dxa" w:w="1872"/>
           </w:tcPr>
           <w:p>
+            <w:pPr>
+              <w:keepNext/>
+            </w:pPr>
             <w:r>
               <w:t>−.005</w:t>
             </w:r>
@@ -4523,11 +5216,17 @@
         </w:tc>
       </w:tr>
       <w:tr>
+        <w:trPr>
+          <w:cantSplit/>
+        </w:trPr>
         <w:tc>
           <w:tcPr>
             <w:tcW w:type="dxa" w:w="1872"/>
           </w:tcPr>
           <w:p>
+            <w:pPr>
+              <w:keepNext/>
+            </w:pPr>
             <w:r>
               <w:t>drawdown state</w:t>
             </w:r>
@@ -4538,6 +5237,9 @@
             <w:tcW w:type="dxa" w:w="1872"/>
           </w:tcPr>
           <w:p>
+            <w:pPr>
+              <w:keepNext/>
+            </w:pPr>
             <w:r>
               <w:t>+.03</w:t>
             </w:r>
@@ -4548,6 +5250,9 @@
             <w:tcW w:type="dxa" w:w="1872"/>
           </w:tcPr>
           <w:p>
+            <w:pPr>
+              <w:keepNext/>
+            </w:pPr>
             <w:r>
               <w:t>−.038</w:t>
             </w:r>
@@ -4558,6 +5263,9 @@
             <w:tcW w:type="dxa" w:w="1872"/>
           </w:tcPr>
           <w:p>
+            <w:pPr>
+              <w:keepNext/>
+            </w:pPr>
             <w:r>
               <w:t>+.66</w:t>
             </w:r>
@@ -4568,6 +5276,9 @@
             <w:tcW w:type="dxa" w:w="1872"/>
           </w:tcPr>
           <w:p>
+            <w:pPr>
+              <w:keepNext/>
+            </w:pPr>
             <w:r>
               <w:t>+.099</w:t>
             </w:r>
@@ -4575,6 +5286,9 @@
         </w:tc>
       </w:tr>
       <w:tr>
+        <w:trPr>
+          <w:cantSplit/>
+        </w:trPr>
         <w:tc>
           <w:tcPr>
             <w:tcW w:type="dxa" w:w="1872"/>
@@ -4753,11 +5467,17 @@
         <w:gridCol w:w="1872"/>
       </w:tblGrid>
       <w:tr>
+        <w:trPr>
+          <w:cantSplit/>
+        </w:trPr>
         <w:tc>
           <w:tcPr>
             <w:tcW w:type="dxa" w:w="1872"/>
           </w:tcPr>
           <w:p>
+            <w:pPr>
+              <w:keepNext/>
+            </w:pPr>
             <w:r>
               <w:t>policy (SPY / CSI300 / NIFTY)</w:t>
             </w:r>
@@ -4768,6 +5488,9 @@
             <w:tcW w:type="dxa" w:w="1872"/>
           </w:tcPr>
           <w:p>
+            <w:pPr>
+              <w:keepNext/>
+            </w:pPr>
             <w:r>
               <w:t>Sharpe</w:t>
             </w:r>
@@ -4778,6 +5501,9 @@
             <w:tcW w:type="dxa" w:w="1872"/>
           </w:tcPr>
           <w:p>
+            <w:pPr>
+              <w:keepNext/>
+            </w:pPr>
             <w:r>
               <w:t>return</w:t>
             </w:r>
@@ -4788,6 +5514,9 @@
             <w:tcW w:type="dxa" w:w="1872"/>
           </w:tcPr>
           <w:p>
+            <w:pPr>
+              <w:keepNext/>
+            </w:pPr>
             <w:r>
               <w:t>maxDD</w:t>
             </w:r>
@@ -4798,6 +5527,9 @@
             <w:tcW w:type="dxa" w:w="1872"/>
           </w:tcPr>
           <w:p>
+            <w:pPr>
+              <w:keepNext/>
+            </w:pPr>
             <w:r>
               <w:t>exposure</w:t>
             </w:r>
@@ -4805,11 +5537,17 @@
         </w:tc>
       </w:tr>
       <w:tr>
+        <w:trPr>
+          <w:cantSplit/>
+        </w:trPr>
         <w:tc>
           <w:tcPr>
             <w:tcW w:type="dxa" w:w="1872"/>
           </w:tcPr>
           <w:p>
+            <w:pPr>
+              <w:keepNext/>
+            </w:pPr>
             <w:r>
               <w:t>buy-and-hold</w:t>
             </w:r>
@@ -4820,6 +5558,9 @@
             <w:tcW w:type="dxa" w:w="1872"/>
           </w:tcPr>
           <w:p>
+            <w:pPr>
+              <w:keepNext/>
+            </w:pPr>
             <w:r>
               <w:t>.784 / −.352 / 1.006</w:t>
             </w:r>
@@ -4830,6 +5571,9 @@
             <w:tcW w:type="dxa" w:w="1872"/>
           </w:tcPr>
           <w:p>
+            <w:pPr>
+              <w:keepNext/>
+            </w:pPr>
             <w:r>
               <w:t>.586 / −.275 / .694</w:t>
             </w:r>
@@ -4840,6 +5584,9 @@
             <w:tcW w:type="dxa" w:w="1872"/>
           </w:tcPr>
           <w:p>
+            <w:pPr>
+              <w:keepNext/>
+            </w:pPr>
             <w:r>
               <w:t>−.253 / −.456 / −.172</w:t>
             </w:r>
@@ -4850,6 +5597,9 @@
             <w:tcW w:type="dxa" w:w="1872"/>
           </w:tcPr>
           <w:p>
+            <w:pPr>
+              <w:keepNext/>
+            </w:pPr>
             <w:r>
               <w:t>1.00</w:t>
             </w:r>
@@ -4857,11 +5607,17 @@
         </w:tc>
       </w:tr>
       <w:tr>
+        <w:trPr>
+          <w:cantSplit/>
+        </w:trPr>
         <w:tc>
           <w:tcPr>
             <w:tcW w:type="dxa" w:w="1872"/>
           </w:tcPr>
           <w:p>
+            <w:pPr>
+              <w:keepNext/>
+            </w:pPr>
             <w:r>
               <w:t>adaptive exposure</w:t>
             </w:r>
@@ -4872,6 +5628,9 @@
             <w:tcW w:type="dxa" w:w="1872"/>
           </w:tcPr>
           <w:p>
+            <w:pPr>
+              <w:keepNext/>
+            </w:pPr>
             <w:r>
               <w:t>.909 / −.355 / 1.033</w:t>
             </w:r>
@@ -4882,6 +5641,9 @@
             <w:tcW w:type="dxa" w:w="1872"/>
           </w:tcPr>
           <w:p>
+            <w:pPr>
+              <w:keepNext/>
+            </w:pPr>
             <w:r>
               <w:t>.309 / −.135 / .271</w:t>
             </w:r>
@@ -4892,6 +5654,9 @@
             <w:tcW w:type="dxa" w:w="1872"/>
           </w:tcPr>
           <w:p>
+            <w:pPr>
+              <w:keepNext/>
+            </w:pPr>
             <w:r>
               <w:t>−.114 / −.253 / −.081</w:t>
             </w:r>
@@ -4902,6 +5667,9 @@
             <w:tcW w:type="dxa" w:w="1872"/>
           </w:tcPr>
           <w:p>
+            <w:pPr>
+              <w:keepNext/>
+            </w:pPr>
             <w:r>
               <w:t>.48</w:t>
             </w:r>
@@ -4909,11 +5677,17 @@
         </w:tc>
       </w:tr>
       <w:tr>
+        <w:trPr>
+          <w:cantSplit/>
+        </w:trPr>
         <w:tc>
           <w:tcPr>
             <w:tcW w:type="dxa" w:w="1872"/>
           </w:tcPr>
           <w:p>
+            <w:pPr>
+              <w:keepNext/>
+            </w:pPr>
             <w:r>
               <w:t>constant 50/50 blend</w:t>
             </w:r>
@@ -4924,6 +5698,9 @@
             <w:tcW w:type="dxa" w:w="1872"/>
           </w:tcPr>
           <w:p>
+            <w:pPr>
+              <w:keepNext/>
+            </w:pPr>
             <w:r>
               <w:t>.827 / −.353 / 1.024</w:t>
             </w:r>
@@ -4934,6 +5711,9 @@
             <w:tcW w:type="dxa" w:w="1872"/>
           </w:tcPr>
           <w:p>
+            <w:pPr>
+              <w:keepNext/>
+            </w:pPr>
             <w:r>
               <w:t>.447 / −.204 / .473</w:t>
             </w:r>
@@ -4944,6 +5724,9 @@
             <w:tcW w:type="dxa" w:w="1872"/>
           </w:tcPr>
           <w:p>
+            <w:pPr>
+              <w:keepNext/>
+            </w:pPr>
             <w:r>
               <w:t>−.184 / −.360 / −.127</w:t>
             </w:r>
@@ -4954,6 +5737,9 @@
             <w:tcW w:type="dxa" w:w="1872"/>
           </w:tcPr>
           <w:p>
+            <w:pPr>
+              <w:keepNext/>
+            </w:pPr>
             <w:r>
               <w:t>.74</w:t>
             </w:r>
@@ -4961,11 +5747,17 @@
         </w:tc>
       </w:tr>
       <w:tr>
+        <w:trPr>
+          <w:cantSplit/>
+        </w:trPr>
         <w:tc>
           <w:tcPr>
             <w:tcW w:type="dxa" w:w="1872"/>
           </w:tcPr>
           <w:p>
+            <w:pPr>
+              <w:keepNext/>
+            </w:pPr>
             <w:r>
               <w:t>floor max(e, .5)</w:t>
             </w:r>
@@ -4976,6 +5768,9 @@
             <w:tcW w:type="dxa" w:w="1872"/>
           </w:tcPr>
           <w:p>
+            <w:pPr>
+              <w:keepNext/>
+            </w:pPr>
             <w:r>
               <w:t>.812 / −.350 / 1.053</w:t>
             </w:r>
@@ -4986,6 +5781,9 @@
             <w:tcW w:type="dxa" w:w="1872"/>
           </w:tcPr>
           <w:p>
+            <w:pPr>
+              <w:keepNext/>
+            </w:pPr>
             <w:r>
               <w:t>.300 / −.135 / .350</w:t>
             </w:r>
@@ -4996,6 +5794,9 @@
             <w:tcW w:type="dxa" w:w="1872"/>
           </w:tcPr>
           <w:p>
+            <w:pPr>
+              <w:keepNext/>
+            </w:pPr>
             <w:r>
               <w:t>−.134 / −.254 / −.087</w:t>
             </w:r>
@@ -5006,6 +5807,9 @@
             <w:tcW w:type="dxa" w:w="1872"/>
           </w:tcPr>
           <w:p>
+            <w:pPr>
+              <w:keepNext/>
+            </w:pPr>
             <w:r>
               <w:t>.51</w:t>
             </w:r>
@@ -5013,6 +5817,9 @@
         </w:tc>
       </w:tr>
       <w:tr>
+        <w:trPr>
+          <w:cantSplit/>
+        </w:trPr>
         <w:tc>
           <w:tcPr>
             <w:tcW w:type="dxa" w:w="1872"/>
@@ -5220,11 +6027,17 @@
         <w:gridCol w:w="1872"/>
       </w:tblGrid>
       <w:tr>
+        <w:trPr>
+          <w:cantSplit/>
+        </w:trPr>
         <w:tc>
           <w:tcPr>
             <w:tcW w:type="dxa" w:w="1872"/>
           </w:tcPr>
           <w:p>
+            <w:pPr>
+              <w:keepNext/>
+            </w:pPr>
             <w:r>
               <w:t>market</w:t>
             </w:r>
@@ -5235,6 +6048,9 @@
             <w:tcW w:type="dxa" w:w="1872"/>
           </w:tcPr>
           <w:p>
+            <w:pPr>
+              <w:keepNext/>
+            </w:pPr>
             <w:r>
               <w:t>BH</w:t>
             </w:r>
@@ -5245,6 +6061,9 @@
             <w:tcW w:type="dxa" w:w="1872"/>
           </w:tcPr>
           <w:p>
+            <w:pPr>
+              <w:keepNext/>
+            </w:pPr>
             <w:r>
               <w:t>adaptive</w:t>
             </w:r>
@@ -5255,6 +6074,9 @@
             <w:tcW w:type="dxa" w:w="1872"/>
           </w:tcPr>
           <w:p>
+            <w:pPr>
+              <w:keepNext/>
+            </w:pPr>
             <w:r>
               <w:t>hybrid</w:t>
             </w:r>
@@ -5265,6 +6087,9 @@
             <w:tcW w:type="dxa" w:w="1872"/>
           </w:tcPr>
           <w:p>
+            <w:pPr>
+              <w:keepNext/>
+            </w:pPr>
             <w:r>
               <w:t>paired Δ (date-block 95% CI)</w:t>
             </w:r>
@@ -5272,11 +6097,17 @@
         </w:tc>
       </w:tr>
       <w:tr>
+        <w:trPr>
+          <w:cantSplit/>
+        </w:trPr>
         <w:tc>
           <w:tcPr>
             <w:tcW w:type="dxa" w:w="1872"/>
           </w:tcPr>
           <w:p>
+            <w:pPr>
+              <w:keepNext/>
+            </w:pPr>
             <w:r>
               <w:t>SPY</w:t>
             </w:r>
@@ -5287,6 +6118,9 @@
             <w:tcW w:type="dxa" w:w="1872"/>
           </w:tcPr>
           <w:p>
+            <w:pPr>
+              <w:keepNext/>
+            </w:pPr>
             <w:r>
               <w:t>.784</w:t>
             </w:r>
@@ -5297,6 +6131,9 @@
             <w:tcW w:type="dxa" w:w="1872"/>
           </w:tcPr>
           <w:p>
+            <w:pPr>
+              <w:keepNext/>
+            </w:pPr>
             <w:r>
               <w:t>.941</w:t>
             </w:r>
@@ -5307,6 +6144,9 @@
             <w:tcW w:type="dxa" w:w="1872"/>
           </w:tcPr>
           <w:p>
+            <w:pPr>
+              <w:keepNext/>
+            </w:pPr>
             <w:r>
               <w:t>.905</w:t>
             </w:r>
@@ -5317,6 +6157,9 @@
             <w:tcW w:type="dxa" w:w="1872"/>
           </w:tcPr>
           <w:p>
+            <w:pPr>
+              <w:keepNext/>
+            </w:pPr>
             <w:r>
               <w:t>+.121 [−.059, .294]</w:t>
             </w:r>
@@ -5324,11 +6167,17 @@
         </w:tc>
       </w:tr>
       <w:tr>
+        <w:trPr>
+          <w:cantSplit/>
+        </w:trPr>
         <w:tc>
           <w:tcPr>
             <w:tcW w:type="dxa" w:w="1872"/>
           </w:tcPr>
           <w:p>
+            <w:pPr>
+              <w:keepNext/>
+            </w:pPr>
             <w:r>
               <w:t>CSI300</w:t>
             </w:r>
@@ -5339,6 +6188,9 @@
             <w:tcW w:type="dxa" w:w="1872"/>
           </w:tcPr>
           <w:p>
+            <w:pPr>
+              <w:keepNext/>
+            </w:pPr>
             <w:r>
               <w:t>−.352</w:t>
             </w:r>
@@ -5349,6 +6201,9 @@
             <w:tcW w:type="dxa" w:w="1872"/>
           </w:tcPr>
           <w:p>
+            <w:pPr>
+              <w:keepNext/>
+            </w:pPr>
             <w:r>
               <w:t>−.350</w:t>
             </w:r>
@@ -5359,6 +6214,9 @@
             <w:tcW w:type="dxa" w:w="1872"/>
           </w:tcPr>
           <w:p>
+            <w:pPr>
+              <w:keepNext/>
+            </w:pPr>
             <w:r>
               <w:t>−.337</w:t>
             </w:r>
@@ -5369,6 +6227,9 @@
             <w:tcW w:type="dxa" w:w="1872"/>
           </w:tcPr>
           <w:p>
+            <w:pPr>
+              <w:keepNext/>
+            </w:pPr>
             <w:r>
               <w:t>+.016 [−.020, .053]</w:t>
             </w:r>
@@ -5376,6 +6237,9 @@
         </w:tc>
       </w:tr>
       <w:tr>
+        <w:trPr>
+          <w:cantSplit/>
+        </w:trPr>
         <w:tc>
           <w:tcPr>
             <w:tcW w:type="dxa" w:w="1872"/>
@@ -5494,11 +6358,17 @@
         <w:gridCol w:w="1560"/>
       </w:tblGrid>
       <w:tr>
+        <w:trPr>
+          <w:cantSplit/>
+        </w:trPr>
         <w:tc>
           <w:tcPr>
             <w:tcW w:type="dxa" w:w="1560"/>
           </w:tcPr>
           <w:p>
+            <w:pPr>
+              <w:keepNext/>
+            </w:pPr>
             <w:r>
               <w:t>market</w:t>
             </w:r>
@@ -5509,6 +6379,9 @@
             <w:tcW w:type="dxa" w:w="1560"/>
           </w:tcPr>
           <w:p>
+            <w:pPr>
+              <w:keepNext/>
+            </w:pPr>
             <w:r>
               <w:t>mean Δ</w:t>
             </w:r>
@@ -5519,6 +6392,9 @@
             <w:tcW w:type="dxa" w:w="1560"/>
           </w:tcPr>
           <w:p>
+            <w:pPr>
+              <w:keepNext/>
+            </w:pPr>
             <w:r>
               <w:t>SD</w:t>
             </w:r>
@@ -5529,6 +6405,9 @@
             <w:tcW w:type="dxa" w:w="1560"/>
           </w:tcPr>
           <w:p>
+            <w:pPr>
+              <w:keepNext/>
+            </w:pPr>
             <w:r>
               <w:t>seed-bootstrap 95% CI</w:t>
             </w:r>
@@ -5539,6 +6418,9 @@
             <w:tcW w:type="dxa" w:w="1560"/>
           </w:tcPr>
           <w:p>
+            <w:pPr>
+              <w:keepNext/>
+            </w:pPr>
             <w:r>
               <w:t>Wilcoxon p</w:t>
             </w:r>
@@ -5549,6 +6431,9 @@
             <w:tcW w:type="dxa" w:w="1560"/>
           </w:tcPr>
           <w:p>
+            <w:pPr>
+              <w:keepNext/>
+            </w:pPr>
             <w:r>
               <w:t>sign (positive)</w:t>
             </w:r>
@@ -5556,11 +6441,17 @@
         </w:tc>
       </w:tr>
       <w:tr>
+        <w:trPr>
+          <w:cantSplit/>
+        </w:trPr>
         <w:tc>
           <w:tcPr>
             <w:tcW w:type="dxa" w:w="1560"/>
           </w:tcPr>
           <w:p>
+            <w:pPr>
+              <w:keepNext/>
+            </w:pPr>
             <w:r>
               <w:t>SPY</w:t>
             </w:r>
@@ -5571,6 +6462,9 @@
             <w:tcW w:type="dxa" w:w="1560"/>
           </w:tcPr>
           <w:p>
+            <w:pPr>
+              <w:keepNext/>
+            </w:pPr>
             <w:r>
               <w:t>+.121</w:t>
             </w:r>
@@ -5581,6 +6475,9 @@
             <w:tcW w:type="dxa" w:w="1560"/>
           </w:tcPr>
           <w:p>
+            <w:pPr>
+              <w:keepNext/>
+            </w:pPr>
             <w:r>
               <w:t>.039</w:t>
             </w:r>
@@ -5591,6 +6488,9 @@
             <w:tcW w:type="dxa" w:w="1560"/>
           </w:tcPr>
           <w:p>
+            <w:pPr>
+              <w:keepNext/>
+            </w:pPr>
             <w:r>
               <w:t>[+.096, +.141]</w:t>
             </w:r>
@@ -5601,6 +6501,9 @@
             <w:tcW w:type="dxa" w:w="1560"/>
           </w:tcPr>
           <w:p>
+            <w:pPr>
+              <w:keepNext/>
+            </w:pPr>
             <w:r>
               <w:t>.002</w:t>
             </w:r>
@@ -5611,6 +6514,9 @@
             <w:tcW w:type="dxa" w:w="1560"/>
           </w:tcPr>
           <w:p>
+            <w:pPr>
+              <w:keepNext/>
+            </w:pPr>
             <w:r>
               <w:t>10/10</w:t>
             </w:r>
@@ -5618,11 +6524,17 @@
         </w:tc>
       </w:tr>
       <w:tr>
+        <w:trPr>
+          <w:cantSplit/>
+        </w:trPr>
         <w:tc>
           <w:tcPr>
             <w:tcW w:type="dxa" w:w="1560"/>
           </w:tcPr>
           <w:p>
+            <w:pPr>
+              <w:keepNext/>
+            </w:pPr>
             <w:r>
               <w:t>CSI300</w:t>
             </w:r>
@@ -5633,6 +6545,9 @@
             <w:tcW w:type="dxa" w:w="1560"/>
           </w:tcPr>
           <w:p>
+            <w:pPr>
+              <w:keepNext/>
+            </w:pPr>
             <w:r>
               <w:t>+.015</w:t>
             </w:r>
@@ -5643,6 +6558,9 @@
             <w:tcW w:type="dxa" w:w="1560"/>
           </w:tcPr>
           <w:p>
+            <w:pPr>
+              <w:keepNext/>
+            </w:pPr>
             <w:r>
               <w:t>.077</w:t>
             </w:r>
@@ -5653,6 +6571,9 @@
             <w:tcW w:type="dxa" w:w="1560"/>
           </w:tcPr>
           <w:p>
+            <w:pPr>
+              <w:keepNext/>
+            </w:pPr>
             <w:r>
               <w:t>[−.030, +.062]</w:t>
             </w:r>
@@ -5663,6 +6584,9 @@
             <w:tcW w:type="dxa" w:w="1560"/>
           </w:tcPr>
           <w:p>
+            <w:pPr>
+              <w:keepNext/>
+            </w:pPr>
             <w:r>
               <w:t>.695</w:t>
             </w:r>
@@ -5673,6 +6597,9 @@
             <w:tcW w:type="dxa" w:w="1560"/>
           </w:tcPr>
           <w:p>
+            <w:pPr>
+              <w:keepNext/>
+            </w:pPr>
             <w:r>
               <w:t>5/10</w:t>
             </w:r>
@@ -5680,6 +6607,9 @@
         </w:tc>
       </w:tr>
       <w:tr>
+        <w:trPr>
+          <w:cantSplit/>
+        </w:trPr>
         <w:tc>
           <w:tcPr>
             <w:tcW w:type="dxa" w:w="1560"/>
@@ -6001,11 +6931,17 @@
         <w:gridCol w:w="3120"/>
       </w:tblGrid>
       <w:tr>
+        <w:trPr>
+          <w:cantSplit/>
+        </w:trPr>
         <w:tc>
           <w:tcPr>
             <w:tcW w:type="dxa" w:w="3120"/>
           </w:tcPr>
           <w:p>
+            <w:pPr>
+              <w:keepNext/>
+            </w:pPr>
             <w:r>
               <w:t>policy</w:t>
             </w:r>
@@ -6016,6 +6952,9 @@
             <w:tcW w:type="dxa" w:w="3120"/>
           </w:tcPr>
           <w:p>
+            <w:pPr>
+              <w:keepNext/>
+            </w:pPr>
             <w:r>
               <w:t>SPY (ret/vol/Sharpe)</w:t>
             </w:r>
@@ -6026,6 +6965,9 @@
             <w:tcW w:type="dxa" w:w="3120"/>
           </w:tcPr>
           <w:p>
+            <w:pPr>
+              <w:keepNext/>
+            </w:pPr>
             <w:r>
               <w:t>NIFTY (ret/vol/Sharpe)</w:t>
             </w:r>
@@ -6033,11 +6975,17 @@
         </w:tc>
       </w:tr>
       <w:tr>
+        <w:trPr>
+          <w:cantSplit/>
+        </w:trPr>
         <w:tc>
           <w:tcPr>
             <w:tcW w:type="dxa" w:w="3120"/>
           </w:tcPr>
           <w:p>
+            <w:pPr>
+              <w:keepNext/>
+            </w:pPr>
             <w:r>
               <w:t>buy-and-hold (ray)</w:t>
             </w:r>
@@ -6048,6 +6996,9 @@
             <w:tcW w:type="dxa" w:w="3120"/>
           </w:tcPr>
           <w:p>
+            <w:pPr>
+              <w:keepNext/>
+            </w:pPr>
             <w:r>
               <w:t>.129 / .165 / .784</w:t>
             </w:r>
@@ -6058,6 +7009,9 @@
             <w:tcW w:type="dxa" w:w="3120"/>
           </w:tcPr>
           <w:p>
+            <w:pPr>
+              <w:keepNext/>
+            </w:pPr>
             <w:r>
               <w:t>.147 / .146 / 1.006</w:t>
             </w:r>
@@ -6065,11 +7019,17 @@
         </w:tc>
       </w:tr>
       <w:tr>
+        <w:trPr>
+          <w:cantSplit/>
+        </w:trPr>
         <w:tc>
           <w:tcPr>
             <w:tcW w:type="dxa" w:w="3120"/>
           </w:tcPr>
           <w:p>
+            <w:pPr>
+              <w:keepNext/>
+            </w:pPr>
             <w:r>
               <w:t>adaptive</w:t>
             </w:r>
@@ -6080,6 +7040,9 @@
             <w:tcW w:type="dxa" w:w="3120"/>
           </w:tcPr>
           <w:p>
+            <w:pPr>
+              <w:keepNext/>
+            </w:pPr>
             <w:r>
               <w:t>.071 / .077 / .927</w:t>
             </w:r>
@@ -6090,6 +7053,9 @@
             <w:tcW w:type="dxa" w:w="3120"/>
           </w:tcPr>
           <w:p>
+            <w:pPr>
+              <w:keepNext/>
+            </w:pPr>
             <w:r>
               <w:t>.064 / .062 / 1.039</w:t>
             </w:r>
@@ -6097,11 +7063,17 @@
         </w:tc>
       </w:tr>
       <w:tr>
+        <w:trPr>
+          <w:cantSplit/>
+        </w:trPr>
         <w:tc>
           <w:tcPr>
             <w:tcW w:type="dxa" w:w="3120"/>
           </w:tcPr>
           <w:p>
+            <w:pPr>
+              <w:keepNext/>
+            </w:pPr>
             <w:r>
               <w:t>regime-constrained</w:t>
             </w:r>
@@ -6112,6 +7084,9 @@
             <w:tcW w:type="dxa" w:w="3120"/>
           </w:tcPr>
           <w:p>
+            <w:pPr>
+              <w:keepNext/>
+            </w:pPr>
             <w:r>
               <w:t>.055 / .066 / .822</w:t>
             </w:r>
@@ -6122,6 +7097,9 @@
             <w:tcW w:type="dxa" w:w="3120"/>
           </w:tcPr>
           <w:p>
+            <w:pPr>
+              <w:keepNext/>
+            </w:pPr>
             <w:r>
               <w:t>.034 / .035 / .981</w:t>
             </w:r>
@@ -6129,11 +7107,17 @@
         </w:tc>
       </w:tr>
       <w:tr>
+        <w:trPr>
+          <w:cantSplit/>
+        </w:trPr>
         <w:tc>
           <w:tcPr>
             <w:tcW w:type="dxa" w:w="3120"/>
           </w:tcPr>
           <w:p>
+            <w:pPr>
+              <w:keepNext/>
+            </w:pPr>
             <w:r>
               <w:t>floor max(e,.5)</w:t>
             </w:r>
@@ -6144,6 +7128,9 @@
             <w:tcW w:type="dxa" w:w="3120"/>
           </w:tcPr>
           <w:p>
+            <w:pPr>
+              <w:keepNext/>
+            </w:pPr>
             <w:r>
               <w:t>.071 / .086 / .819</w:t>
             </w:r>
@@ -6154,6 +7141,9 @@
             <w:tcW w:type="dxa" w:w="3120"/>
           </w:tcPr>
           <w:p>
+            <w:pPr>
+              <w:keepNext/>
+            </w:pPr>
             <w:r>
               <w:t>.081 / .077 / 1.054</w:t>
             </w:r>
@@ -6161,11 +7151,17 @@
         </w:tc>
       </w:tr>
       <w:tr>
+        <w:trPr>
+          <w:cantSplit/>
+        </w:trPr>
         <w:tc>
           <w:tcPr>
             <w:tcW w:type="dxa" w:w="3120"/>
           </w:tcPr>
           <w:p>
+            <w:pPr>
+              <w:keepNext/>
+            </w:pPr>
             <w:r>
               <w:t>hybrid</w:t>
             </w:r>
@@ -6176,6 +7172,9 @@
             <w:tcW w:type="dxa" w:w="3120"/>
           </w:tcPr>
           <w:p>
+            <w:pPr>
+              <w:keepNext/>
+            </w:pPr>
             <w:r>
               <w:t>.096 / .106 / .900</w:t>
             </w:r>
@@ -6186,6 +7185,9 @@
             <w:tcW w:type="dxa" w:w="3120"/>
           </w:tcPr>
           <w:p>
+            <w:pPr>
+              <w:keepNext/>
+            </w:pPr>
             <w:r>
               <w:t>.124 / .108 / 1.146</w:t>
             </w:r>
@@ -6193,6 +7195,9 @@
         </w:tc>
       </w:tr>
       <w:tr>
+        <w:trPr>
+          <w:cantSplit/>
+        </w:trPr>
         <w:tc>
           <w:tcPr>
             <w:tcW w:type="dxa" w:w="3120"/>
@@ -6373,7 +7378,7 @@
       <w:r>
         <w:drawing>
           <wp:inline xmlns:a="http://schemas.openxmlformats.org/drawingml/2006/main" xmlns:pic="http://schemas.openxmlformats.org/drawingml/2006/picture">
-            <wp:extent cx="5303520" cy="1473200"/>
+            <wp:extent cx="5303520" cy="1393313"/>
             <wp:docPr id="3" name="Picture 3"/>
             <wp:cNvGraphicFramePr>
               <a:graphicFrameLocks noChangeAspect="1"/>
@@ -6394,7 +7399,7 @@
                   <pic:spPr>
                     <a:xfrm>
                       <a:off x="0" y="0"/>
-                      <a:ext cx="5303520" cy="1473200"/>
+                      <a:ext cx="5303520" cy="1393313"/>
                     </a:xfrm>
                     <a:prstGeom prst="rect"/>
                   </pic:spPr>
@@ -7365,11 +8370,17 @@
         <w:gridCol w:w="1872"/>
       </w:tblGrid>
       <w:tr>
+        <w:trPr>
+          <w:cantSplit/>
+        </w:trPr>
         <w:tc>
           <w:tcPr>
             <w:tcW w:type="dxa" w:w="1872"/>
           </w:tcPr>
           <w:p>
+            <w:pPr>
+              <w:keepNext/>
+            </w:pPr>
             <w:r>
               <w:t>rep</w:t>
             </w:r>
@@ -7380,6 +8391,9 @@
             <w:tcW w:type="dxa" w:w="1872"/>
           </w:tcPr>
           <w:p>
+            <w:pPr>
+              <w:keepNext/>
+            </w:pPr>
             <w:r>
               <w:t>bc=0 collapse</w:t>
             </w:r>
@@ -7390,6 +8404,9 @@
             <w:tcW w:type="dxa" w:w="1872"/>
           </w:tcPr>
           <w:p>
+            <w:pPr>
+              <w:keepNext/>
+            </w:pPr>
             <w:r>
               <w:t>bc=0 Sharpe</w:t>
             </w:r>
@@ -7400,6 +8417,9 @@
             <w:tcW w:type="dxa" w:w="1872"/>
           </w:tcPr>
           <w:p>
+            <w:pPr>
+              <w:keepNext/>
+            </w:pPr>
             <w:r>
               <w:t>bc=.5 collapse</w:t>
             </w:r>
@@ -7410,6 +8430,9 @@
             <w:tcW w:type="dxa" w:w="1872"/>
           </w:tcPr>
           <w:p>
+            <w:pPr>
+              <w:keepNext/>
+            </w:pPr>
             <w:r>
               <w:t>bc=.5 Sharpe</w:t>
             </w:r>
@@ -7417,11 +8440,17 @@
         </w:tc>
       </w:tr>
       <w:tr>
+        <w:trPr>
+          <w:cantSplit/>
+        </w:trPr>
         <w:tc>
           <w:tcPr>
             <w:tcW w:type="dxa" w:w="1872"/>
           </w:tcPr>
           <w:p>
+            <w:pPr>
+              <w:keepNext/>
+            </w:pPr>
             <w:r>
               <w:t>raw</w:t>
             </w:r>
@@ -7432,6 +8461,9 @@
             <w:tcW w:type="dxa" w:w="1872"/>
           </w:tcPr>
           <w:p>
+            <w:pPr>
+              <w:keepNext/>
+            </w:pPr>
             <w:r>
               <w:t>.60</w:t>
             </w:r>
@@ -7442,6 +8474,9 @@
             <w:tcW w:type="dxa" w:w="1872"/>
           </w:tcPr>
           <w:p>
+            <w:pPr>
+              <w:keepNext/>
+            </w:pPr>
             <w:r>
               <w:t>.568</w:t>
             </w:r>
@@ -7452,6 +8487,9 @@
             <w:tcW w:type="dxa" w:w="1872"/>
           </w:tcPr>
           <w:p>
+            <w:pPr>
+              <w:keepNext/>
+            </w:pPr>
             <w:r>
               <w:t>.00</w:t>
             </w:r>
@@ -7462,6 +8500,9 @@
             <w:tcW w:type="dxa" w:w="1872"/>
           </w:tcPr>
           <w:p>
+            <w:pPr>
+              <w:keepNext/>
+            </w:pPr>
             <w:r>
               <w:t>.574</w:t>
             </w:r>
@@ -7469,11 +8510,17 @@
         </w:tc>
       </w:tr>
       <w:tr>
+        <w:trPr>
+          <w:cantSplit/>
+        </w:trPr>
         <w:tc>
           <w:tcPr>
             <w:tcW w:type="dxa" w:w="1872"/>
           </w:tcPr>
           <w:p>
+            <w:pPr>
+              <w:keepNext/>
+            </w:pPr>
             <w:r>
               <w:t>auto</w:t>
             </w:r>
@@ -7484,6 +8531,9 @@
             <w:tcW w:type="dxa" w:w="1872"/>
           </w:tcPr>
           <w:p>
+            <w:pPr>
+              <w:keepNext/>
+            </w:pPr>
             <w:r>
               <w:t>.30</w:t>
             </w:r>
@@ -7494,6 +8544,9 @@
             <w:tcW w:type="dxa" w:w="1872"/>
           </w:tcPr>
           <w:p>
+            <w:pPr>
+              <w:keepNext/>
+            </w:pPr>
             <w:r>
               <w:t>.256</w:t>
             </w:r>
@@ -7504,6 +8557,9 @@
             <w:tcW w:type="dxa" w:w="1872"/>
           </w:tcPr>
           <w:p>
+            <w:pPr>
+              <w:keepNext/>
+            </w:pPr>
             <w:r>
               <w:t>.00</w:t>
             </w:r>
@@ -7514,6 +8570,9 @@
             <w:tcW w:type="dxa" w:w="1872"/>
           </w:tcPr>
           <w:p>
+            <w:pPr>
+              <w:keepNext/>
+            </w:pPr>
             <w:r>
               <w:t>.768</w:t>
             </w:r>
@@ -7521,11 +8580,17 @@
         </w:tc>
       </w:tr>
       <w:tr>
+        <w:trPr>
+          <w:cantSplit/>
+        </w:trPr>
         <w:tc>
           <w:tcPr>
             <w:tcW w:type="dxa" w:w="1872"/>
           </w:tcPr>
           <w:p>
+            <w:pPr>
+              <w:keepNext/>
+            </w:pPr>
             <w:r>
               <w:t>predictive</w:t>
             </w:r>
@@ -7536,6 +8601,9 @@
             <w:tcW w:type="dxa" w:w="1872"/>
           </w:tcPr>
           <w:p>
+            <w:pPr>
+              <w:keepNext/>
+            </w:pPr>
             <w:r>
               <w:t>.40</w:t>
             </w:r>
@@ -7546,6 +8614,9 @@
             <w:tcW w:type="dxa" w:w="1872"/>
           </w:tcPr>
           <w:p>
+            <w:pPr>
+              <w:keepNext/>
+            </w:pPr>
             <w:r>
               <w:t>.232</w:t>
             </w:r>
@@ -7556,6 +8627,9 @@
             <w:tcW w:type="dxa" w:w="1872"/>
           </w:tcPr>
           <w:p>
+            <w:pPr>
+              <w:keepNext/>
+            </w:pPr>
             <w:r>
               <w:t>.00</w:t>
             </w:r>
@@ -7566,6 +8640,9 @@
             <w:tcW w:type="dxa" w:w="1872"/>
           </w:tcPr>
           <w:p>
+            <w:pPr>
+              <w:keepNext/>
+            </w:pPr>
             <w:r>
               <w:t>.676</w:t>
             </w:r>
@@ -7573,6 +8650,9 @@
         </w:tc>
       </w:tr>
       <w:tr>
+        <w:trPr>
+          <w:cantSplit/>
+        </w:trPr>
         <w:tc>
           <w:tcPr>
             <w:tcW w:type="dxa" w:w="1872"/>
@@ -7675,11 +8755,17 @@
         <w:gridCol w:w="3120"/>
       </w:tblGrid>
       <w:tr>
+        <w:trPr>
+          <w:cantSplit/>
+        </w:trPr>
         <w:tc>
           <w:tcPr>
             <w:tcW w:type="dxa" w:w="3120"/>
           </w:tcPr>
           <w:p>
+            <w:pPr>
+              <w:keepNext/>
+            </w:pPr>
             <w:r>
               <w:t>component</w:t>
             </w:r>
@@ -7690,6 +8776,9 @@
             <w:tcW w:type="dxa" w:w="3120"/>
           </w:tcPr>
           <w:p>
+            <w:pPr>
+              <w:keepNext/>
+            </w:pPr>
             <w:r>
               <w:t>development (exploratory)</w:t>
             </w:r>
@@ -7700,6 +8789,9 @@
             <w:tcW w:type="dxa" w:w="3120"/>
           </w:tcPr>
           <w:p>
+            <w:pPr>
+              <w:keepNext/>
+            </w:pPr>
             <w:r>
               <w:t>validation (primary, reported)</w:t>
             </w:r>
@@ -7707,11 +8799,17 @@
         </w:tc>
       </w:tr>
       <w:tr>
+        <w:trPr>
+          <w:cantSplit/>
+        </w:trPr>
         <w:tc>
           <w:tcPr>
             <w:tcW w:type="dxa" w:w="3120"/>
           </w:tcPr>
           <w:p>
+            <w:pPr>
+              <w:keepNext/>
+            </w:pPr>
             <w:r>
               <w:t>representation</w:t>
             </w:r>
@@ -7722,6 +8820,9 @@
             <w:tcW w:type="dxa" w:w="3120"/>
           </w:tcPr>
           <w:p>
+            <w:pPr>
+              <w:keepNext/>
+            </w:pPr>
             <w:r>
               <w:t>predictive / contrastive, 3 seeds</w:t>
             </w:r>
@@ -7732,6 +8833,9 @@
             <w:tcW w:type="dxa" w:w="3120"/>
           </w:tcPr>
           <w:p>
+            <w:pPr>
+              <w:keepNext/>
+            </w:pPr>
             <w:r>
               <w:t>frozen, 1 seed encoder</w:t>
             </w:r>
@@ -7739,11 +8843,17 @@
         </w:tc>
       </w:tr>
       <w:tr>
+        <w:trPr>
+          <w:cantSplit/>
+        </w:trPr>
         <w:tc>
           <w:tcPr>
             <w:tcW w:type="dxa" w:w="3120"/>
           </w:tcPr>
           <w:p>
+            <w:pPr>
+              <w:keepNext/>
+            </w:pPr>
             <w:r>
               <w:t>feature &amp; latent sweeps</w:t>
             </w:r>
@@ -7754,6 +8864,9 @@
             <w:tcW w:type="dxa" w:w="3120"/>
           </w:tcPr>
           <w:p>
+            <w:pPr>
+              <w:keepNext/>
+            </w:pPr>
             <w:r>
               <w:t>10 seeds (separate axis)</w:t>
             </w:r>
@@ -7764,6 +8877,9 @@
             <w:tcW w:type="dxa" w:w="3120"/>
           </w:tcPr>
           <w:p>
+            <w:pPr>
+              <w:keepNext/>
+            </w:pPr>
             <w:r>
               <w:t>not revisited</w:t>
             </w:r>
@@ -7771,11 +8887,17 @@
         </w:tc>
       </w:tr>
       <w:tr>
+        <w:trPr>
+          <w:cantSplit/>
+        </w:trPr>
         <w:tc>
           <w:tcPr>
             <w:tcW w:type="dxa" w:w="3120"/>
           </w:tcPr>
           <w:p>
+            <w:pPr>
+              <w:keepNext/>
+            </w:pPr>
             <w:r>
               <w:t>hybrid functional form</w:t>
             </w:r>
@@ -7786,6 +8908,9 @@
             <w:tcW w:type="dxa" w:w="3120"/>
           </w:tcPr>
           <w:p>
+            <w:pPr>
+              <w:keepNext/>
+            </w:pPr>
             <w:r>
               <w:t>a = e + α(1 − e) selected</w:t>
             </w:r>
@@ -7796,6 +8921,9 @@
             <w:tcW w:type="dxa" w:w="3120"/>
           </w:tcPr>
           <w:p>
+            <w:pPr>
+              <w:keepNext/>
+            </w:pPr>
             <w:r>
               <w:t>frozen</w:t>
             </w:r>
@@ -7803,11 +8931,17 @@
         </w:tc>
       </w:tr>
       <w:tr>
+        <w:trPr>
+          <w:cantSplit/>
+        </w:trPr>
         <w:tc>
           <w:tcPr>
             <w:tcW w:type="dxa" w:w="3120"/>
           </w:tcPr>
           <w:p>
+            <w:pPr>
+              <w:keepNext/>
+            </w:pPr>
             <w:r>
               <w:t>α inputs</w:t>
             </w:r>
@@ -7818,6 +8952,9 @@
             <w:tcW w:type="dxa" w:w="3120"/>
           </w:tcPr>
           <w:p>
+            <w:pPr>
+              <w:keepNext/>
+            </w:pPr>
             <w:r>
               <w:t>{risk, OOD, volatility} selected</w:t>
             </w:r>
@@ -7828,6 +8965,9 @@
             <w:tcW w:type="dxa" w:w="3120"/>
           </w:tcPr>
           <w:p>
+            <w:pPr>
+              <w:keepNext/>
+            </w:pPr>
             <w:r>
               <w:t>frozen (ablation is diagnostic only)</w:t>
             </w:r>
@@ -7835,11 +8975,17 @@
         </w:tc>
       </w:tr>
       <w:tr>
+        <w:trPr>
+          <w:cantSplit/>
+        </w:trPr>
         <w:tc>
           <w:tcPr>
             <w:tcW w:type="dxa" w:w="3120"/>
           </w:tcPr>
           <w:p>
+            <w:pPr>
+              <w:keepNext/>
+            </w:pPr>
             <w:r>
               <w:t>α architecture</w:t>
             </w:r>
@@ -7850,6 +8996,9 @@
             <w:tcW w:type="dxa" w:w="3120"/>
           </w:tcPr>
           <w:p>
+            <w:pPr>
+              <w:keepNext/>
+            </w:pPr>
             <w:r>
               <w:t>3-parameter linear+sigmoid</w:t>
             </w:r>
@@ -7860,6 +9009,9 @@
             <w:tcW w:type="dxa" w:w="3120"/>
           </w:tcPr>
           <w:p>
+            <w:pPr>
+              <w:keepNext/>
+            </w:pPr>
             <w:r>
               <w:t>frozen</w:t>
             </w:r>
@@ -7867,11 +9019,17 @@
         </w:tc>
       </w:tr>
       <w:tr>
+        <w:trPr>
+          <w:cantSplit/>
+        </w:trPr>
         <w:tc>
           <w:tcPr>
             <w:tcW w:type="dxa" w:w="3120"/>
           </w:tcPr>
           <w:p>
+            <w:pPr>
+              <w:keepNext/>
+            </w:pPr>
             <w:r>
               <w:t>seeds for hybrid</w:t>
             </w:r>
@@ -7882,6 +9040,9 @@
             <w:tcW w:type="dxa" w:w="3120"/>
           </w:tcPr>
           <w:p>
+            <w:pPr>
+              <w:keepNext/>
+            </w:pPr>
             <w:r>
               <w:t>3 (development), 5 (frontier)</w:t>
             </w:r>
@@ -7892,6 +9053,9 @@
             <w:tcW w:type="dxa" w:w="3120"/>
           </w:tcPr>
           <w:p>
+            <w:pPr>
+              <w:keepNext/>
+            </w:pPr>
             <w:r>
               <w:t>10 new/seeded runs</w:t>
             </w:r>
@@ -7899,11 +9063,17 @@
         </w:tc>
       </w:tr>
       <w:tr>
+        <w:trPr>
+          <w:cantSplit/>
+        </w:trPr>
         <w:tc>
           <w:tcPr>
             <w:tcW w:type="dxa" w:w="3120"/>
           </w:tcPr>
           <w:p>
+            <w:pPr>
+              <w:keepNext/>
+            </w:pPr>
             <w:r>
               <w:t>test period</w:t>
             </w:r>
@@ -7914,6 +9084,9 @@
             <w:tcW w:type="dxa" w:w="3120"/>
           </w:tcPr>
           <w:p>
+            <w:pPr>
+              <w:keepNext/>
+            </w:pPr>
             <w:r>
               <w:t>2021–2024</w:t>
             </w:r>
@@ -7924,6 +9097,9 @@
             <w:tcW w:type="dxa" w:w="3120"/>
           </w:tcPr>
           <w:p>
+            <w:pPr>
+              <w:keepNext/>
+            </w:pPr>
             <w:r>
               <w:t>2021–2024 (unchanged)</w:t>
             </w:r>
@@ -7931,11 +9107,17 @@
         </w:tc>
       </w:tr>
       <w:tr>
+        <w:trPr>
+          <w:cantSplit/>
+        </w:trPr>
         <w:tc>
           <w:tcPr>
             <w:tcW w:type="dxa" w:w="3120"/>
           </w:tcPr>
           <w:p>
+            <w:pPr>
+              <w:keepNext/>
+            </w:pPr>
             <w:r>
               <w:t>cost assumption</w:t>
             </w:r>
@@ -7946,6 +9128,9 @@
             <w:tcW w:type="dxa" w:w="3120"/>
           </w:tcPr>
           <w:p>
+            <w:pPr>
+              <w:keepNext/>
+            </w:pPr>
             <w:r>
               <w:t>0 bp for the map</w:t>
             </w:r>
@@ -7956,6 +9141,9 @@
             <w:tcW w:type="dxa" w:w="3120"/>
           </w:tcPr>
           <w:p>
+            <w:pPr>
+              <w:keepNext/>
+            </w:pPr>
             <w:r>
               <w:t>0/1/5/10 bp robustness</w:t>
             </w:r>
@@ -7963,6 +9151,9 @@
         </w:tc>
       </w:tr>
       <w:tr>
+        <w:trPr>
+          <w:cantSplit/>
+        </w:trPr>
         <w:tc>
           <w:tcPr>
             <w:tcW w:type="dxa" w:w="3120"/>

</xml_diff>

<commit_message>
Restyle Figure 1: styled pathway diagram replaces ASCII in Sec5.3
- new scripts/rep_pathway_figure.py -> paper/fig1_pathway.png (boxed/colored, no monospace)
- Figure 1 now placed at end of Introduction (correct numbering); Sec5.3 references it, ASCII removed
- remove duplicate early schematic from build scripts; artifact index updated
- case-consistency: Behaviour->Behavior
- regenerate PDF (22 pp) and DOCX
</commit_message>
<xml_diff>
--- a/paper/manuscript_representation_utility.docx
+++ b/paper/manuscript_representation_utility.docx
@@ -514,6 +514,58 @@
         <w:t xml:space="preserve">   validation, input ablations, transaction-cost robustness, and temporal</w:t>
         <w:br/>
         <w:t xml:space="preserve">   permutation controls.</w:t>
+      </w:r>
+    </w:p>
+    <w:p>
+      <w:pPr>
+        <w:jc w:val="center"/>
+      </w:pPr>
+      <w:r>
+        <w:drawing>
+          <wp:inline xmlns:a="http://schemas.openxmlformats.org/drawingml/2006/main" xmlns:pic="http://schemas.openxmlformats.org/drawingml/2006/picture">
+            <wp:extent cx="5303520" cy="4248056"/>
+            <wp:docPr id="1" name="Picture 1"/>
+            <wp:cNvGraphicFramePr>
+              <a:graphicFrameLocks noChangeAspect="1"/>
+            </wp:cNvGraphicFramePr>
+            <a:graphic>
+              <a:graphicData uri="http://schemas.openxmlformats.org/drawingml/2006/picture">
+                <pic:pic>
+                  <pic:nvPicPr>
+                    <pic:cNvPr id="0" name="fig1_pathway.png"/>
+                    <pic:cNvPicPr/>
+                  </pic:nvPicPr>
+                  <pic:blipFill>
+                    <a:blip r:embed="rId9"/>
+                    <a:stretch>
+                      <a:fillRect/>
+                    </a:stretch>
+                  </pic:blipFill>
+                  <pic:spPr>
+                    <a:xfrm>
+                      <a:off x="0" y="0"/>
+                      <a:ext cx="5303520" cy="4248056"/>
+                    </a:xfrm>
+                    <a:prstGeom prst="rect"/>
+                  </pic:spPr>
+                </pic:pic>
+              </a:graphicData>
+            </a:graphic>
+          </wp:inline>
+        </w:drawing>
+      </w:r>
+    </w:p>
+    <w:p>
+      <w:pPr>
+        <w:jc w:val="center"/>
+      </w:pPr>
+      <w:r>
+        <w:rPr>
+          <w:i/>
+          <w:color w:val="444444"/>
+          <w:sz w:val="18"/>
+        </w:rPr>
+        <w:t>Figure 1. Decision-relevant risk/exposure pathway: directional information terminates (no measurable skill); risk-state information supports adaptive exposure and a risk-aware hybrid. Dashed arrows mark the mechanism tested in §4.5-4.9.</w:t>
       </w:r>
     </w:p>
     <w:p>
@@ -2905,7 +2957,7 @@
           <w:b w:val="0"/>
           <w:i w:val="0"/>
         </w:rPr>
-        <w:t>Behaviour-policy divergence and regime conditioning provide a plausible</w:t>
+        <w:t>Behavior-policy divergence and regime conditioning provide a plausible</w:t>
         <w:br/>
         <w:t>explanation for why some algorithms appear more representation-sensitive. The</w:t>
         <w:br/>
@@ -3209,58 +3261,6 @@
         <w:t>fully-deviating (A2C) endpoints and approaches the oracle. Gains over behavior</w:t>
         <w:br/>
         <w:t>cloning are modest and at/below the buy-and-hold baseline.</w:t>
-      </w:r>
-    </w:p>
-    <w:p>
-      <w:pPr>
-        <w:jc w:val="center"/>
-      </w:pPr>
-      <w:r>
-        <w:drawing>
-          <wp:inline xmlns:a="http://schemas.openxmlformats.org/drawingml/2006/main" xmlns:pic="http://schemas.openxmlformats.org/drawingml/2006/picture">
-            <wp:extent cx="5303520" cy="4377308"/>
-            <wp:docPr id="1" name="Picture 1"/>
-            <wp:cNvGraphicFramePr>
-              <a:graphicFrameLocks noChangeAspect="1"/>
-            </wp:cNvGraphicFramePr>
-            <a:graphic>
-              <a:graphicData uri="http://schemas.openxmlformats.org/drawingml/2006/picture">
-                <pic:pic>
-                  <pic:nvPicPr>
-                    <pic:cNvPr id="0" name="rep_mechanism_schematic.png"/>
-                    <pic:cNvPicPr/>
-                  </pic:nvPicPr>
-                  <pic:blipFill>
-                    <a:blip r:embed="rId9"/>
-                    <a:stretch>
-                      <a:fillRect/>
-                    </a:stretch>
-                  </pic:blipFill>
-                  <pic:spPr>
-                    <a:xfrm>
-                      <a:off x="0" y="0"/>
-                      <a:ext cx="5303520" cy="4377308"/>
-                    </a:xfrm>
-                    <a:prstGeom prst="rect"/>
-                  </pic:spPr>
-                </pic:pic>
-              </a:graphicData>
-            </a:graphic>
-          </wp:inline>
-        </w:drawing>
-      </w:r>
-    </w:p>
-    <w:p>
-      <w:pPr>
-        <w:jc w:val="center"/>
-      </w:pPr>
-      <w:r>
-        <w:rPr>
-          <w:i/>
-          <w:color w:val="444444"/>
-          <w:sz w:val="18"/>
-        </w:rPr>
-        <w:t>Figure 1. Decision-relevant pathway: representation -&gt; directional information (terminates, ~chance) / risk-state information -&gt; adaptive exposure -&gt; hybrid. Consistent across tested markets; paired Sharpe advantage not significant at 5%.</w:t>
       </w:r>
     </w:p>
     <w:p>
@@ -7508,7 +7508,7 @@
           <w:i w:val="0"/>
         </w:rPr>
         <w:br/>
-        <w:t>- Behaviour-policy divergence ↔ representation sensitivity (r = .935, n = 4;</w:t>
+        <w:t>- Behavior-policy divergence ↔ representation sensitivity (r = .935, n = 4;</w:t>
         <w:br/>
         <w:t xml:space="preserve">  descriptive).</w:t>
         <w:br/>
@@ -7654,176 +7654,28 @@
         <w:pStyle w:val="Heading2"/>
       </w:pPr>
       <w:r>
-        <w:t>5.3 Figure 1 — decision-relevant risk/exposure pathway</w:t>
+        <w:t>5.3 Decision-relevant risk/exposure pathway</w:t>
       </w:r>
     </w:p>
     <w:p>
       <w:r>
         <w:rPr>
-          <w:rFonts w:ascii="Consolas" w:hAnsi="Consolas"/>
-          <w:sz w:val="17"/>
-        </w:rPr>
-        <w:t xml:space="preserve">                    OBSERVED ASSOCIATIONS</w:t>
-      </w:r>
-      <w:r>
-        <w:br/>
-      </w:r>
-      <w:r>
-        <w:rPr>
-          <w:rFonts w:ascii="Consolas" w:hAnsi="Consolas"/>
-          <w:sz w:val="17"/>
-        </w:rPr>
-        <w:t xml:space="preserve">                            |</w:t>
-      </w:r>
-      <w:r>
-        <w:br/>
-      </w:r>
-      <w:r>
-        <w:rPr>
-          <w:rFonts w:ascii="Consolas" w:hAnsi="Consolas"/>
-          <w:sz w:val="17"/>
-        </w:rPr>
-        <w:t xml:space="preserve">        +-------------------+-------------------+</w:t>
-      </w:r>
-      <w:r>
-        <w:br/>
-      </w:r>
-      <w:r>
-        <w:rPr>
-          <w:rFonts w:ascii="Consolas" w:hAnsi="Consolas"/>
-          <w:sz w:val="17"/>
-        </w:rPr>
-        <w:t xml:space="preserve">        v                   v                   v</w:t>
-      </w:r>
-      <w:r>
-        <w:br/>
-      </w:r>
-      <w:r>
-        <w:rPr>
-          <w:rFonts w:ascii="Consolas" w:hAnsi="Consolas"/>
-          <w:sz w:val="17"/>
-        </w:rPr>
-        <w:t xml:space="preserve"> Representation      Decision algorithm    Market regime</w:t>
-      </w:r>
-      <w:r>
-        <w:br/>
-      </w:r>
-      <w:r>
-        <w:rPr>
-          <w:rFonts w:ascii="Consolas" w:hAnsi="Consolas"/>
-          <w:sz w:val="17"/>
-        </w:rPr>
-        <w:t xml:space="preserve">        |                   |                   |</w:t>
-      </w:r>
-      <w:r>
-        <w:br/>
-      </w:r>
-      <w:r>
-        <w:rPr>
-          <w:rFonts w:ascii="Consolas" w:hAnsi="Consolas"/>
-          <w:sz w:val="17"/>
-        </w:rPr>
-        <w:t xml:space="preserve">        |                   v                   |</w:t>
-      </w:r>
-      <w:r>
-        <w:br/>
-      </w:r>
-      <w:r>
-        <w:rPr>
-          <w:rFonts w:ascii="Consolas" w:hAnsi="Consolas"/>
-          <w:sz w:val="17"/>
-        </w:rPr>
-        <w:t xml:space="preserve">        |           Policy divergence           |</w:t>
-      </w:r>
-      <w:r>
-        <w:br/>
-      </w:r>
-      <w:r>
-        <w:rPr>
-          <w:rFonts w:ascii="Consolas" w:hAnsi="Consolas"/>
-          <w:sz w:val="17"/>
-        </w:rPr>
-        <w:t xml:space="preserve">        |                   |                   |</w:t>
-      </w:r>
-      <w:r>
-        <w:br/>
-      </w:r>
-      <w:r>
-        <w:rPr>
-          <w:rFonts w:ascii="Consolas" w:hAnsi="Consolas"/>
-          <w:sz w:val="17"/>
-        </w:rPr>
-        <w:t xml:space="preserve">        +---------+---------+                   |</w:t>
-      </w:r>
-      <w:r>
-        <w:br/>
-      </w:r>
-      <w:r>
-        <w:rPr>
-          <w:rFonts w:ascii="Consolas" w:hAnsi="Consolas"/>
-          <w:sz w:val="17"/>
-        </w:rPr>
-        <w:t xml:space="preserve">                  v                             v</w:t>
-      </w:r>
-      <w:r>
-        <w:br/>
-      </w:r>
-      <w:r>
-        <w:rPr>
-          <w:rFonts w:ascii="Consolas" w:hAnsi="Consolas"/>
-          <w:sz w:val="17"/>
-        </w:rPr>
-        <w:t xml:space="preserve">          Representation               Regime-dependent</w:t>
-      </w:r>
-      <w:r>
-        <w:br/>
-      </w:r>
-      <w:r>
-        <w:rPr>
-          <w:rFonts w:ascii="Consolas" w:hAnsi="Consolas"/>
-          <w:sz w:val="17"/>
-        </w:rPr>
-        <w:t xml:space="preserve">             sensitivity                    utility</w:t>
-      </w:r>
-      <w:r>
-        <w:br/>
-      </w:r>
-      <w:r>
-        <w:rPr>
-          <w:rFonts w:ascii="Consolas" w:hAnsi="Consolas"/>
-          <w:sz w:val="17"/>
-        </w:rPr>
-        <w:t xml:space="preserve">                  |                             |</w:t>
-      </w:r>
-      <w:r>
-        <w:br/>
-      </w:r>
-      <w:r>
-        <w:rPr>
-          <w:rFonts w:ascii="Consolas" w:hAnsi="Consolas"/>
-          <w:sz w:val="17"/>
-        </w:rPr>
-        <w:t xml:space="preserve">                  +-------------+---------------+</w:t>
-      </w:r>
-      <w:r>
-        <w:br/>
-      </w:r>
-      <w:r>
-        <w:rPr>
-          <w:rFonts w:ascii="Consolas" w:hAnsi="Consolas"/>
-          <w:sz w:val="17"/>
-        </w:rPr>
-        <w:t xml:space="preserve">                                v</w:t>
-      </w:r>
-      <w:r>
-        <w:br/>
-      </w:r>
-      <w:r>
-        <w:rPr>
-          <w:rFonts w:ascii="Consolas" w:hAnsi="Consolas"/>
-          <w:sz w:val="17"/>
-        </w:rPr>
-        <w:t xml:space="preserve">               Decision-relevant risk/exposure pathway</w:t>
+          <w:b w:val="0"/>
+          <w:i w:val="0"/>
+        </w:rPr>
+        <w:t>Figure 1 (a graphical overview placed at the end of the Introduction)</w:t>
+        <w:br/>
+        <w:t>summarizes the two pathways that the experiments separate. Directional</w:t>
+        <w:br/>
+        <w:t>information is present in neither the input nor the encoding at any tested</w:t>
+        <w:br/>
+        <w:t>feature count or latent dimension (the red branch terminates), whereas</w:t>
+        <w:br/>
+        <w:t>risk-state information (OOD distance, volatility, drawdown state) is recoverable</w:t>
+        <w:br/>
+        <w:t>and can be converted into adaptive exposure and a risk-aware hybrid (the green</w:t>
+        <w:br/>
+        <w:t>branch). The two stages are related but not causally connected.</w:t>
       </w:r>
     </w:p>
     <w:p>
@@ -7832,13 +7684,13 @@
           <w:b w:val="0"/>
           <w:i w:val="0"/>
         </w:rPr>
-        <w:t>Solid arrows are observed associations; dashed arrows (in the manuscript</w:t>
-        <w:br/>
-        <w:t>figure) denote the mechanism tested constructively in §4.5–4.9: it is</w:t>
-        <w:br/>
-        <w:t>consistent across the tested markets, but the paired Sharpe advantage is not</w:t>
-        <w:br/>
-        <w:t>statistically significant at 5% on the single four-year test period.</w:t>
+        <w:t>Dashed arrows denote the mechanism tested constructively in §4.5–4.9: it is</w:t>
+        <w:br/>
+        <w:t>consistent across the tested markets, and the hybrid advantage is seed-robust on</w:t>
+        <w:br/>
+        <w:t>SPY, but it is not statistically established when training and finite-test-path</w:t>
+        <w:br/>
+        <w:t>uncertainty are both considered.</w:t>
       </w:r>
     </w:p>
     <w:p>
@@ -8233,7 +8085,7 @@
         <w:br/>
         <w:t>cross-seed stability—do not provide a reliable one-dimensional proxy for</w:t>
         <w:br/>
-        <w:t>trading utility. Behaviour-policy divergence and regime conditioning offer a</w:t>
+        <w:t>trading utility. Behavior-policy divergence and regime conditioning offer a</w:t>
         <w:br/>
         <w:t>plausible mechanism for why some algorithms are more representation-sensitive.</w:t>
         <w:br/>
@@ -9570,14 +9422,65 @@
           <w:i w:val="0"/>
           <w:sz w:val="19"/>
         </w:rPr>
-        <w:t>paper/rep_mechanism_schematic.png</w:t>
+        <w:t>paper/fig1_pathway.png</w:t>
       </w:r>
       <w:r>
         <w:rPr>
           <w:b w:val="0"/>
           <w:i w:val="0"/>
         </w:rPr>
-        <w:t xml:space="preserve"> — Figure 1.</w:t>
+        <w:t xml:space="preserve"> — Figure 1; </w:t>
+      </w:r>
+      <w:r>
+        <w:rPr>
+          <w:rFonts w:ascii="Consolas" w:hAnsi="Consolas"/>
+          <w:b w:val="0"/>
+          <w:i w:val="0"/>
+          <w:sz w:val="19"/>
+        </w:rPr>
+        <w:t>paper/hybrid_mechanism.png</w:t>
+      </w:r>
+      <w:r>
+        <w:rPr>
+          <w:b w:val="0"/>
+          <w:i w:val="0"/>
+        </w:rPr>
+        <w:t xml:space="preserve"> — Figure 2;</w:t>
+        <w:br/>
+        <w:t xml:space="preserve">  </w:t>
+      </w:r>
+      <w:r>
+        <w:rPr>
+          <w:rFonts w:ascii="Consolas" w:hAnsi="Consolas"/>
+          <w:b w:val="0"/>
+          <w:i w:val="0"/>
+          <w:sz w:val="19"/>
+        </w:rPr>
+        <w:t>paper/risk_return_frontier.png</w:t>
+      </w:r>
+      <w:r>
+        <w:rPr>
+          <w:b w:val="0"/>
+          <w:i w:val="0"/>
+        </w:rPr>
+        <w:t xml:space="preserve"> — Figure 3; </w:t>
+      </w:r>
+      <w:r>
+        <w:rPr>
+          <w:rFonts w:ascii="Consolas" w:hAnsi="Consolas"/>
+          <w:b w:val="0"/>
+          <w:i w:val="0"/>
+          <w:sz w:val="19"/>
+        </w:rPr>
+        <w:t>paper/rep_divergence_regime.png</w:t>
+      </w:r>
+      <w:r>
+        <w:rPr>
+          <w:b w:val="0"/>
+          <w:i w:val="0"/>
+        </w:rPr>
+        <w:br/>
+        <w:t xml:space="preserve">  — Figure A1.</w:t>
       </w:r>
     </w:p>
     <w:p>

</xml_diff>